<commit_message>
colocando cursos nas licencas da junta
</commit_message>
<xml_diff>
--- a/src/template/modelo_junta.docx
+++ b/src/template/modelo_junta.docx
@@ -2,18 +2,6 @@
 <file path=word/document.xml><?xml version="1.0" encoding="utf-8"?>
 <w:document xmlns:wpc="http://schemas.microsoft.com/office/word/2010/wordprocessingCanvas" xmlns:cx="http://schemas.microsoft.com/office/drawing/2014/chartex" xmlns:mc="http://schemas.openxmlformats.org/markup-compatibility/2006" xmlns:o="urn:schemas-microsoft-com:office:office" xmlns:r="http://schemas.openxmlformats.org/officeDocument/2006/relationships" xmlns:m="http://schemas.openxmlformats.org/officeDocument/2006/math" xmlns:v="urn:schemas-microsoft-com:vml" xmlns:wp14="http://schemas.microsoft.com/office/word/2010/wordprocessingDrawing" xmlns:wp="http://schemas.openxmlformats.org/drawingml/2006/wordprocessingDrawing" xmlns:w10="urn:schemas-microsoft-com:office:word" xmlns:w="http://schemas.openxmlformats.org/wordprocessingml/2006/main" xmlns:w14="http://schemas.microsoft.com/office/word/2010/wordml" xmlns:w15="http://schemas.microsoft.com/office/word/2012/wordml" xmlns:w16se="http://schemas.microsoft.com/office/word/2015/wordml/symex" xmlns:wpg="http://schemas.microsoft.com/office/word/2010/wordprocessingGroup" xmlns:wpi="http://schemas.microsoft.com/office/word/2010/wordprocessingInk" xmlns:wne="http://schemas.microsoft.com/office/word/2006/wordml" xmlns:wps="http://schemas.microsoft.com/office/word/2010/wordprocessingShape" mc:Ignorable="w14 w15 w16se wp14">
   <w:body>
-    <w:p>
-      <w:pPr>
-        <w:tabs>
-          <w:tab w:val="left" w:pos="2655"/>
-        </w:tabs>
-        <w:spacing w:line="276" w:lineRule="auto"/>
-        <w:rPr>
-          <w:sz w:val="22"/>
-          <w:szCs w:val="22"/>
-        </w:rPr>
-      </w:pPr>
-    </w:p>
     <w:p>
       <w:pPr>
         <w:tabs>
@@ -668,7 +656,6 @@
             <w:tcW w:w="1271" w:type="dxa"/>
           </w:tcPr>
           <w:p>
-            <w:r/>
             <w:r>
               <w:t>{%tr for item in lts %}</w:t>
             </w:r>
@@ -678,28 +665,19 @@
           <w:tcPr>
             <w:tcW w:w="5528" w:type="dxa"/>
           </w:tcPr>
-          <w:p>
-            <w:r/>
-            <w:r/>
-          </w:p>
+          <w:p/>
         </w:tc>
         <w:tc>
           <w:tcPr>
             <w:tcW w:w="2127" w:type="dxa"/>
           </w:tcPr>
-          <w:p>
-            <w:r/>
-            <w:r/>
-          </w:p>
+          <w:p/>
         </w:tc>
         <w:tc>
           <w:tcPr>
             <w:tcW w:w="845" w:type="dxa"/>
           </w:tcPr>
-          <w:p>
-            <w:r/>
-            <w:r/>
-          </w:p>
+          <w:p/>
         </w:tc>
       </w:tr>
       <w:tr>
@@ -708,7 +686,6 @@
             <w:tcW w:w="1271" w:type="dxa"/>
           </w:tcPr>
           <w:p>
-            <w:r/>
             <w:r>
               <w:t>{{ item.posto_grad_quadro }}</w:t>
             </w:r>
@@ -719,7 +696,6 @@
             <w:tcW w:w="5528" w:type="dxa"/>
           </w:tcPr>
           <w:p>
-            <w:r/>
             <w:r>
               <w:t>{{ item.nome_completo }}</w:t>
             </w:r>
@@ -740,7 +716,6 @@
             <w:tcW w:w="2127" w:type="dxa"/>
           </w:tcPr>
           <w:p>
-            <w:r/>
             <w:r>
               <w:t>PRONTO PARA SV</w:t>
             </w:r>
@@ -756,7 +731,6 @@
             <w:tcW w:w="845" w:type="dxa"/>
           </w:tcPr>
           <w:p>
-            <w:r/>
             <w:r>
               <w:t>{{ item.rg }}</w:t>
             </w:r>
@@ -774,7 +748,6 @@
             <w:tcW w:w="1271" w:type="dxa"/>
           </w:tcPr>
           <w:p>
-            <w:r/>
             <w:r>
               <w:t>{%tr endfor %}</w:t>
             </w:r>
@@ -784,28 +757,19 @@
           <w:tcPr>
             <w:tcW w:w="5528" w:type="dxa"/>
           </w:tcPr>
-          <w:p>
-            <w:r/>
-            <w:r/>
-          </w:p>
+          <w:p/>
         </w:tc>
         <w:tc>
           <w:tcPr>
             <w:tcW w:w="2127" w:type="dxa"/>
           </w:tcPr>
-          <w:p>
-            <w:r/>
-            <w:r/>
-          </w:p>
+          <w:p/>
         </w:tc>
         <w:tc>
           <w:tcPr>
             <w:tcW w:w="845" w:type="dxa"/>
           </w:tcPr>
-          <w:p>
-            <w:r/>
-            <w:r/>
-          </w:p>
+          <w:p/>
         </w:tc>
       </w:tr>
     </w:tbl>
@@ -841,8 +805,6 @@
       <w:r>
         <w:t xml:space="preserve"> %}</w:t>
       </w:r>
-      <w:bookmarkStart w:id="1" w:name="_GoBack"/>
-      <w:bookmarkEnd w:id="1"/>
     </w:p>
     <w:p>
       <w:pPr>
@@ -1089,7 +1051,6 @@
             <w:vAlign w:val="center"/>
           </w:tcPr>
           <w:p>
-            <w:r/>
             <w:r>
               <w:t>{%tr for item in apto_recom %}</w:t>
             </w:r>
@@ -1100,30 +1061,21 @@
             <w:tcW w:w="5528" w:type="dxa"/>
             <w:vAlign w:val="center"/>
           </w:tcPr>
-          <w:p>
-            <w:r/>
-            <w:r/>
-          </w:p>
+          <w:p/>
         </w:tc>
         <w:tc>
           <w:tcPr>
             <w:tcW w:w="2127" w:type="dxa"/>
             <w:vAlign w:val="center"/>
           </w:tcPr>
-          <w:p>
-            <w:r/>
-            <w:r/>
-          </w:p>
+          <w:p/>
         </w:tc>
         <w:tc>
           <w:tcPr>
             <w:tcW w:w="1060" w:type="dxa"/>
             <w:vAlign w:val="center"/>
           </w:tcPr>
-          <w:p>
-            <w:r/>
-            <w:r/>
-          </w:p>
+          <w:p/>
         </w:tc>
       </w:tr>
       <w:tr>
@@ -1134,7 +1086,6 @@
             <w:vAlign w:val="center"/>
           </w:tcPr>
           <w:p>
-            <w:r/>
             <w:r>
               <w:t>{{ item.posto_grad_quadro }}</w:t>
             </w:r>
@@ -1146,7 +1097,6 @@
             <w:vAlign w:val="center"/>
           </w:tcPr>
           <w:p>
-            <w:r/>
             <w:r>
               <w:t>{{item.nome_completo}}</w:t>
             </w:r>
@@ -1173,7 +1123,6 @@
             <w:vAlign w:val="center"/>
           </w:tcPr>
           <w:p>
-            <w:r/>
             <w:r>
               <w:t>PRONTO PARA SV</w:t>
             </w:r>
@@ -1190,7 +1139,6 @@
             <w:vAlign w:val="center"/>
           </w:tcPr>
           <w:p>
-            <w:r/>
             <w:r>
               <w:t>{{item.rg}}</w:t>
             </w:r>
@@ -1210,7 +1158,6 @@
             <w:vAlign w:val="center"/>
           </w:tcPr>
           <w:p>
-            <w:r/>
             <w:r>
               <w:t>{%tr endfor %}</w:t>
             </w:r>
@@ -1221,30 +1168,21 @@
             <w:tcW w:w="5528" w:type="dxa"/>
             <w:vAlign w:val="center"/>
           </w:tcPr>
-          <w:p>
-            <w:r/>
-            <w:r/>
-          </w:p>
+          <w:p/>
         </w:tc>
         <w:tc>
           <w:tcPr>
             <w:tcW w:w="2127" w:type="dxa"/>
             <w:vAlign w:val="center"/>
           </w:tcPr>
-          <w:p>
-            <w:r/>
-            <w:r/>
-          </w:p>
+          <w:p/>
         </w:tc>
         <w:tc>
           <w:tcPr>
             <w:tcW w:w="1060" w:type="dxa"/>
             <w:vAlign w:val="center"/>
           </w:tcPr>
-          <w:p>
-            <w:r/>
-            <w:r/>
-          </w:p>
+          <w:p/>
         </w:tc>
       </w:tr>
     </w:tbl>
@@ -1259,6 +1197,7 @@
         </w:rPr>
       </w:pPr>
       <w:r>
+        <w:lastRenderedPageBreak/>
         <w:t xml:space="preserve">{% </w:t>
       </w:r>
       <w:proofErr w:type="spellStart"/>
@@ -1445,7 +1384,6 @@
                 <w:szCs w:val="22"/>
                 <w:lang w:eastAsia="en-US"/>
               </w:rPr>
-              <w:lastRenderedPageBreak/>
               <w:t>2º TEN</w:t>
             </w:r>
           </w:p>
@@ -5234,6 +5172,55 @@
           <w:szCs w:val="22"/>
         </w:rPr>
       </w:pPr>
+      <w:r>
+        <w:rPr>
+          <w:b/>
+          <w:color w:val="000000" w:themeColor="text1"/>
+          <w:sz w:val="22"/>
+          <w:szCs w:val="22"/>
+        </w:rPr>
+        <w:t xml:space="preserve">{% </w:t>
+      </w:r>
+      <w:proofErr w:type="spellStart"/>
+      <w:r>
+        <w:rPr>
+          <w:b/>
+          <w:color w:val="000000" w:themeColor="text1"/>
+          <w:sz w:val="22"/>
+          <w:szCs w:val="22"/>
+        </w:rPr>
+        <w:t>if</w:t>
+      </w:r>
+      <w:proofErr w:type="spellEnd"/>
+      <w:r>
+        <w:rPr>
+          <w:b/>
+          <w:color w:val="000000" w:themeColor="text1"/>
+          <w:sz w:val="22"/>
+          <w:szCs w:val="22"/>
+        </w:rPr>
+        <w:t xml:space="preserve"> </w:t>
+      </w:r>
+      <w:proofErr w:type="spellStart"/>
+      <w:r>
+        <w:rPr>
+          <w:b/>
+          <w:color w:val="000000" w:themeColor="text1"/>
+          <w:sz w:val="22"/>
+          <w:szCs w:val="22"/>
+        </w:rPr>
+        <w:t>tem_curso</w:t>
+      </w:r>
+      <w:proofErr w:type="spellEnd"/>
+      <w:r>
+        <w:rPr>
+          <w:b/>
+          <w:color w:val="000000" w:themeColor="text1"/>
+          <w:sz w:val="22"/>
+          <w:szCs w:val="22"/>
+        </w:rPr>
+        <w:t xml:space="preserve"> %}</w:t>
+      </w:r>
     </w:p>
     <w:p>
       <w:pPr>
@@ -5271,7 +5258,7 @@
           <w:sz w:val="22"/>
           <w:szCs w:val="22"/>
         </w:rPr>
-        <w:t xml:space="preserve">, PARA FINS </w:t>
+        <w:t xml:space="preserve"> NA INSPENÇÃO DE SAÚDE</w:t>
       </w:r>
       <w:r>
         <w:rPr>
@@ -5280,7 +5267,7 @@
           <w:sz w:val="22"/>
           <w:szCs w:val="22"/>
         </w:rPr>
-        <w:t>DE CURSO</w:t>
+        <w:t xml:space="preserve">, PARA FINS </w:t>
       </w:r>
       <w:r>
         <w:rPr>
@@ -5289,7 +5276,7 @@
           <w:sz w:val="22"/>
           <w:szCs w:val="22"/>
         </w:rPr>
-        <w:t xml:space="preserve"> D</w:t>
+        <w:t>DE CURSO</w:t>
       </w:r>
       <w:r>
         <w:rPr>
@@ -5298,9 +5285,8 @@
           <w:sz w:val="22"/>
           <w:szCs w:val="22"/>
         </w:rPr>
-        <w:t xml:space="preserve">O </w:t>
-      </w:r>
-      <w:proofErr w:type="spellStart"/>
+        <w:t xml:space="preserve"> D</w:t>
+      </w:r>
       <w:r>
         <w:rPr>
           <w:b/>
@@ -5308,7 +5294,7 @@
           <w:sz w:val="22"/>
           <w:szCs w:val="22"/>
         </w:rPr>
-        <w:t>CESA</w:t>
+        <w:t xml:space="preserve">O </w:t>
       </w:r>
       <w:r>
         <w:rPr>
@@ -5317,9 +5303,8 @@
           <w:sz w:val="22"/>
           <w:szCs w:val="22"/>
         </w:rPr>
-        <w:t>lt</w:t>
-      </w:r>
-      <w:proofErr w:type="spellEnd"/>
+        <w:t>{{curso}}</w:t>
+      </w:r>
       <w:r>
         <w:rPr>
           <w:b/>
@@ -5327,7 +5312,7 @@
           <w:sz w:val="22"/>
           <w:szCs w:val="22"/>
         </w:rPr>
-        <w:t xml:space="preserve"> - </w:t>
+        <w:t xml:space="preserve"> </w:t>
       </w:r>
       <w:r>
         <w:rPr>
@@ -5336,7 +5321,7 @@
           <w:sz w:val="22"/>
           <w:szCs w:val="22"/>
         </w:rPr>
-        <w:t>2026</w:t>
+        <w:t>–</w:t>
       </w:r>
       <w:r>
         <w:rPr>
@@ -5345,7 +5330,7 @@
           <w:sz w:val="22"/>
           <w:szCs w:val="22"/>
         </w:rPr>
-        <w:t>,</w:t>
+        <w:t xml:space="preserve"> </w:t>
       </w:r>
       <w:r>
         <w:rPr>
@@ -5354,8 +5339,9 @@
           <w:sz w:val="22"/>
           <w:szCs w:val="22"/>
         </w:rPr>
-        <w:t xml:space="preserve"> CONFORME </w:t>
-      </w:r>
+        <w:t>{{</w:t>
+      </w:r>
+      <w:proofErr w:type="spellStart"/>
       <w:r>
         <w:rPr>
           <w:b/>
@@ -5363,8 +5349,9 @@
           <w:sz w:val="22"/>
           <w:szCs w:val="22"/>
         </w:rPr>
-        <w:t xml:space="preserve">BG Nº </w:t>
-      </w:r>
+        <w:t>ano_atual</w:t>
+      </w:r>
+      <w:proofErr w:type="spellEnd"/>
       <w:r>
         <w:rPr>
           <w:b/>
@@ -5372,7 +5359,7 @@
           <w:sz w:val="22"/>
           <w:szCs w:val="22"/>
         </w:rPr>
-        <w:t>32</w:t>
+        <w:t>}}</w:t>
       </w:r>
       <w:r>
         <w:rPr>
@@ -5381,7 +5368,7 @@
           <w:sz w:val="22"/>
           <w:szCs w:val="22"/>
         </w:rPr>
-        <w:t xml:space="preserve"> DE </w:t>
+        <w:t>,</w:t>
       </w:r>
       <w:r>
         <w:rPr>
@@ -5390,8 +5377,10 @@
           <w:sz w:val="22"/>
           <w:szCs w:val="22"/>
         </w:rPr>
-        <w:t>20</w:t>
-      </w:r>
+        <w:t xml:space="preserve"> </w:t>
+      </w:r>
+      <w:bookmarkStart w:id="1" w:name="_GoBack"/>
+      <w:bookmarkEnd w:id="1"/>
       <w:r>
         <w:rPr>
           <w:b/>
@@ -5399,7 +5388,7 @@
           <w:sz w:val="22"/>
           <w:szCs w:val="22"/>
         </w:rPr>
-        <w:t xml:space="preserve"> DE </w:t>
+        <w:t xml:space="preserve">CONFORME </w:t>
       </w:r>
       <w:r>
         <w:rPr>
@@ -5408,7 +5397,7 @@
           <w:sz w:val="22"/>
           <w:szCs w:val="22"/>
         </w:rPr>
-        <w:t>FEVEREIRO</w:t>
+        <w:t xml:space="preserve">BG Nº </w:t>
       </w:r>
       <w:r>
         <w:rPr>
@@ -5417,24 +5406,104 @@
           <w:sz w:val="22"/>
           <w:szCs w:val="22"/>
         </w:rPr>
-        <w:t xml:space="preserve"> DE 2026.</w:t>
-      </w:r>
+        <w:t>{{</w:t>
+      </w:r>
+      <w:proofErr w:type="spellStart"/>
+      <w:r>
+        <w:rPr>
+          <w:b/>
+          <w:bCs/>
+          <w:sz w:val="22"/>
+          <w:szCs w:val="22"/>
+        </w:rPr>
+        <w:t>numero_bg</w:t>
+      </w:r>
+      <w:proofErr w:type="spellEnd"/>
+      <w:r>
+        <w:rPr>
+          <w:b/>
+          <w:bCs/>
+          <w:sz w:val="22"/>
+          <w:szCs w:val="22"/>
+        </w:rPr>
+        <w:t>}}</w:t>
+      </w:r>
+      <w:r>
+        <w:rPr>
+          <w:b/>
+          <w:bCs/>
+          <w:sz w:val="22"/>
+          <w:szCs w:val="22"/>
+        </w:rPr>
+        <w:t xml:space="preserve"> DE</w:t>
+      </w:r>
+      <w:r>
+        <w:rPr>
+          <w:b/>
+          <w:bCs/>
+          <w:sz w:val="22"/>
+          <w:szCs w:val="22"/>
+        </w:rPr>
+        <w:t xml:space="preserve"> {{</w:t>
+      </w:r>
+      <w:proofErr w:type="spellStart"/>
+      <w:r>
+        <w:rPr>
+          <w:b/>
+          <w:bCs/>
+          <w:sz w:val="22"/>
+          <w:szCs w:val="22"/>
+        </w:rPr>
+        <w:t>data_extenso</w:t>
+      </w:r>
+      <w:proofErr w:type="spellEnd"/>
+      <w:r>
+        <w:rPr>
+          <w:b/>
+          <w:bCs/>
+          <w:sz w:val="22"/>
+          <w:szCs w:val="22"/>
+        </w:rPr>
+        <w:t>}}</w:t>
+      </w:r>
+      <w:r>
+        <w:rPr>
+          <w:b/>
+          <w:bCs/>
+          <w:sz w:val="22"/>
+          <w:szCs w:val="22"/>
+        </w:rPr>
+        <w:t>.</w:t>
+      </w:r>
+    </w:p>
+    <w:p>
+      <w:pPr>
+        <w:pStyle w:val="SemEspaamento"/>
+        <w:jc w:val="both"/>
+        <w:rPr>
+          <w:b/>
+          <w:bCs/>
+          <w:sz w:val="22"/>
+          <w:szCs w:val="22"/>
+        </w:rPr>
+      </w:pPr>
     </w:p>
     <w:tbl>
       <w:tblPr>
         <w:tblStyle w:val="Tabelacomgrade"/>
         <w:tblW w:w="9776" w:type="dxa"/>
+        <w:tblLayout w:type="fixed"/>
         <w:tblLook w:val="04A0" w:firstRow="1" w:lastRow="0" w:firstColumn="1" w:lastColumn="0" w:noHBand="0" w:noVBand="1"/>
       </w:tblPr>
       <w:tblGrid>
-        <w:gridCol w:w="1011"/>
-        <w:gridCol w:w="1819"/>
-        <w:gridCol w:w="6946"/>
+        <w:gridCol w:w="988"/>
+        <w:gridCol w:w="2007"/>
+        <w:gridCol w:w="6781"/>
       </w:tblGrid>
       <w:tr>
         <w:tc>
           <w:tcPr>
-            <w:tcW w:w="1011" w:type="dxa"/>
+            <w:tcW w:w="988" w:type="dxa"/>
           </w:tcPr>
           <w:p>
             <w:pPr>
@@ -5456,7 +5525,7 @@
         </w:tc>
         <w:tc>
           <w:tcPr>
-            <w:tcW w:w="1819" w:type="dxa"/>
+            <w:tcW w:w="2007" w:type="dxa"/>
           </w:tcPr>
           <w:p>
             <w:pPr>
@@ -5481,7 +5550,7 @@
         </w:tc>
         <w:tc>
           <w:tcPr>
-            <w:tcW w:w="6946" w:type="dxa"/>
+            <w:tcW w:w="6781" w:type="dxa"/>
           </w:tcPr>
           <w:p>
             <w:pPr>
@@ -5508,28 +5577,24 @@
       <w:tr>
         <w:tc>
           <w:tcPr>
-            <w:tcW w:w="1011" w:type="dxa"/>
+            <w:tcW w:w="988" w:type="dxa"/>
             <w:vAlign w:val="center"/>
           </w:tcPr>
           <w:p>
             <w:pPr>
               <w:pStyle w:val="SemEspaamento"/>
-              <w:numPr>
-                <w:ilvl w:val="0"/>
-                <w:numId w:val="34"/>
-              </w:numPr>
-              <w:jc w:val="center"/>
-              <w:rPr>
-                <w:sz w:val="22"/>
-                <w:szCs w:val="22"/>
-                <w:lang w:eastAsia="en-US"/>
-              </w:rPr>
-            </w:pPr>
-          </w:p>
-        </w:tc>
-        <w:tc>
-          <w:tcPr>
-            <w:tcW w:w="1819" w:type="dxa"/>
+              <w:ind w:left="164"/>
+              <w:rPr>
+                <w:sz w:val="22"/>
+                <w:szCs w:val="22"/>
+                <w:lang w:eastAsia="en-US"/>
+              </w:rPr>
+            </w:pPr>
+          </w:p>
+        </w:tc>
+        <w:tc>
+          <w:tcPr>
+            <w:tcW w:w="2007" w:type="dxa"/>
             <w:vAlign w:val="center"/>
           </w:tcPr>
           <w:p>
@@ -5545,11 +5610,40 @@
                 <w:lang w:eastAsia="en-US"/>
               </w:rPr>
             </w:pPr>
-          </w:p>
-        </w:tc>
-        <w:tc>
-          <w:tcPr>
-            <w:tcW w:w="6946" w:type="dxa"/>
+            <w:r>
+              <w:rPr>
+                <w:b/>
+                <w:bCs/>
+                <w:sz w:val="22"/>
+                <w:szCs w:val="22"/>
+              </w:rPr>
+              <w:t xml:space="preserve">{% </w:t>
+            </w:r>
+            <w:proofErr w:type="spellStart"/>
+            <w:r>
+              <w:rPr>
+                <w:b/>
+                <w:bCs/>
+                <w:sz w:val="22"/>
+                <w:szCs w:val="22"/>
+              </w:rPr>
+              <w:t>tr</w:t>
+            </w:r>
+            <w:proofErr w:type="spellEnd"/>
+            <w:r>
+              <w:rPr>
+                <w:b/>
+                <w:bCs/>
+                <w:sz w:val="22"/>
+                <w:szCs w:val="22"/>
+              </w:rPr>
+              <w:t xml:space="preserve"> for item in curso %}</w:t>
+            </w:r>
+          </w:p>
+        </w:tc>
+        <w:tc>
+          <w:tcPr>
+            <w:tcW w:w="6781" w:type="dxa"/>
             <w:vAlign w:val="center"/>
           </w:tcPr>
           <w:p>
@@ -5572,30 +5666,30 @@
         </w:tc>
       </w:tr>
       <w:tr>
-        <w:tc>
-          <w:tcPr>
-            <w:tcW w:w="1011" w:type="dxa"/>
+        <w:trPr>
+          <w:trHeight w:val="381"/>
+        </w:trPr>
+        <w:tc>
+          <w:tcPr>
+            <w:tcW w:w="988" w:type="dxa"/>
             <w:vAlign w:val="center"/>
           </w:tcPr>
           <w:p>
             <w:pPr>
               <w:pStyle w:val="SemEspaamento"/>
-              <w:numPr>
-                <w:ilvl w:val="0"/>
-                <w:numId w:val="34"/>
-              </w:numPr>
-              <w:jc w:val="center"/>
-              <w:rPr>
-                <w:sz w:val="22"/>
-                <w:szCs w:val="22"/>
-                <w:lang w:eastAsia="en-US"/>
-              </w:rPr>
-            </w:pPr>
-          </w:p>
-        </w:tc>
-        <w:tc>
-          <w:tcPr>
-            <w:tcW w:w="1819" w:type="dxa"/>
+              <w:ind w:left="164"/>
+              <w:rPr>
+                <w:b/>
+                <w:bCs/>
+                <w:sz w:val="22"/>
+                <w:szCs w:val="22"/>
+              </w:rPr>
+            </w:pPr>
+          </w:p>
+        </w:tc>
+        <w:tc>
+          <w:tcPr>
+            <w:tcW w:w="2007" w:type="dxa"/>
             <w:vAlign w:val="center"/>
           </w:tcPr>
           <w:p>
@@ -5611,11 +5705,46 @@
                 <w:lang w:eastAsia="en-US"/>
               </w:rPr>
             </w:pPr>
-          </w:p>
-        </w:tc>
-        <w:tc>
-          <w:tcPr>
-            <w:tcW w:w="6946" w:type="dxa"/>
+            <w:r>
+              <w:t xml:space="preserve">{{ </w:t>
+            </w:r>
+            <w:proofErr w:type="spellStart"/>
+            <w:r>
+              <w:t>item.posto_grad_quadro</w:t>
+            </w:r>
+            <w:proofErr w:type="spellEnd"/>
+            <w:r>
+              <w:t xml:space="preserve"> }}</w:t>
+            </w:r>
+          </w:p>
+        </w:tc>
+        <w:tc>
+          <w:tcPr>
+            <w:tcW w:w="6781" w:type="dxa"/>
+            <w:vAlign w:val="center"/>
+          </w:tcPr>
+          <w:p>
+            <w:pPr>
+              <w:jc w:val="center"/>
+            </w:pPr>
+            <w:r>
+              <w:t xml:space="preserve">{{ </w:t>
+            </w:r>
+            <w:proofErr w:type="spellStart"/>
+            <w:r>
+              <w:t>item.nome_completo</w:t>
+            </w:r>
+            <w:proofErr w:type="spellEnd"/>
+            <w:r>
+              <w:t xml:space="preserve"> }}</w:t>
+            </w:r>
+          </w:p>
+        </w:tc>
+      </w:tr>
+      <w:tr>
+        <w:tc>
+          <w:tcPr>
+            <w:tcW w:w="988" w:type="dxa"/>
             <w:vAlign w:val="center"/>
           </w:tcPr>
           <w:p>
@@ -5627,43 +5756,19 @@
                 <w:tab w:val="left" w:pos="9214"/>
                 <w:tab w:val="left" w:pos="9923"/>
               </w:tabs>
-              <w:jc w:val="center"/>
+              <w:ind w:right="-144"/>
               <w:rPr>
                 <w:b/>
-                <w:bCs/>
-                <w:sz w:val="22"/>
-                <w:szCs w:val="22"/>
-                <w:lang w:eastAsia="en-US"/>
-              </w:rPr>
-            </w:pPr>
-          </w:p>
-        </w:tc>
-      </w:tr>
-      <w:tr>
-        <w:tc>
-          <w:tcPr>
-            <w:tcW w:w="1011" w:type="dxa"/>
-            <w:vAlign w:val="center"/>
-          </w:tcPr>
-          <w:p>
-            <w:pPr>
-              <w:pStyle w:val="SemEspaamento"/>
-              <w:numPr>
-                <w:ilvl w:val="0"/>
-                <w:numId w:val="34"/>
-              </w:numPr>
-              <w:jc w:val="center"/>
-              <w:rPr>
-                <w:sz w:val="22"/>
-                <w:szCs w:val="22"/>
-                <w:lang w:eastAsia="en-US"/>
-              </w:rPr>
-            </w:pPr>
-          </w:p>
-        </w:tc>
-        <w:tc>
-          <w:tcPr>
-            <w:tcW w:w="1819" w:type="dxa"/>
+                <w:color w:val="000000" w:themeColor="text1"/>
+                <w:sz w:val="22"/>
+                <w:szCs w:val="22"/>
+              </w:rPr>
+            </w:pPr>
+          </w:p>
+        </w:tc>
+        <w:tc>
+          <w:tcPr>
+            <w:tcW w:w="2007" w:type="dxa"/>
             <w:vAlign w:val="center"/>
           </w:tcPr>
           <w:p>
@@ -5679,11 +5784,60 @@
                 <w:lang w:eastAsia="en-US"/>
               </w:rPr>
             </w:pPr>
-          </w:p>
-        </w:tc>
-        <w:tc>
-          <w:tcPr>
-            <w:tcW w:w="6946" w:type="dxa"/>
+            <w:r>
+              <w:rPr>
+                <w:b/>
+                <w:color w:val="000000" w:themeColor="text1"/>
+                <w:sz w:val="22"/>
+                <w:szCs w:val="22"/>
+              </w:rPr>
+              <w:t>{%</w:t>
+            </w:r>
+            <w:proofErr w:type="spellStart"/>
+            <w:r>
+              <w:rPr>
+                <w:b/>
+                <w:color w:val="000000" w:themeColor="text1"/>
+                <w:sz w:val="22"/>
+                <w:szCs w:val="22"/>
+              </w:rPr>
+              <w:t>tr</w:t>
+            </w:r>
+            <w:proofErr w:type="spellEnd"/>
+            <w:r>
+              <w:rPr>
+                <w:b/>
+                <w:color w:val="000000" w:themeColor="text1"/>
+                <w:sz w:val="22"/>
+                <w:szCs w:val="22"/>
+              </w:rPr>
+              <w:t xml:space="preserve"> </w:t>
+            </w:r>
+            <w:proofErr w:type="spellStart"/>
+            <w:r>
+              <w:rPr>
+                <w:b/>
+                <w:color w:val="000000" w:themeColor="text1"/>
+                <w:sz w:val="22"/>
+                <w:szCs w:val="22"/>
+              </w:rPr>
+              <w:t>endfor</w:t>
+            </w:r>
+            <w:proofErr w:type="spellEnd"/>
+            <w:r>
+              <w:rPr>
+                <w:b/>
+                <w:color w:val="000000" w:themeColor="text1"/>
+                <w:sz w:val="22"/>
+                <w:szCs w:val="22"/>
+              </w:rPr>
+              <w:t>%}</w:t>
+            </w:r>
+          </w:p>
+        </w:tc>
+        <w:tc>
+          <w:tcPr>
+            <w:tcW w:w="6781" w:type="dxa"/>
             <w:vAlign w:val="center"/>
           </w:tcPr>
           <w:p>
@@ -5705,1933 +5859,54 @@
           </w:p>
         </w:tc>
       </w:tr>
-      <w:tr>
-        <w:tc>
-          <w:tcPr>
-            <w:tcW w:w="1011" w:type="dxa"/>
-            <w:vAlign w:val="center"/>
-          </w:tcPr>
-          <w:p>
-            <w:pPr>
-              <w:pStyle w:val="SemEspaamento"/>
-              <w:numPr>
-                <w:ilvl w:val="0"/>
-                <w:numId w:val="34"/>
-              </w:numPr>
-              <w:jc w:val="center"/>
-              <w:rPr>
-                <w:sz w:val="22"/>
-                <w:szCs w:val="22"/>
-                <w:lang w:eastAsia="en-US"/>
-              </w:rPr>
-            </w:pPr>
-          </w:p>
-        </w:tc>
-        <w:tc>
-          <w:tcPr>
-            <w:tcW w:w="1819" w:type="dxa"/>
-            <w:vAlign w:val="center"/>
-          </w:tcPr>
-          <w:p>
-            <w:pPr>
-              <w:tabs>
-                <w:tab w:val="center" w:pos="2632"/>
-              </w:tabs>
-              <w:jc w:val="center"/>
-              <w:rPr>
-                <w:bCs/>
-                <w:sz w:val="22"/>
-                <w:szCs w:val="22"/>
-                <w:lang w:eastAsia="en-US"/>
-              </w:rPr>
-            </w:pPr>
-          </w:p>
-        </w:tc>
-        <w:tc>
-          <w:tcPr>
-            <w:tcW w:w="6946" w:type="dxa"/>
-            <w:vAlign w:val="center"/>
-          </w:tcPr>
-          <w:p>
-            <w:pPr>
-              <w:tabs>
-                <w:tab w:val="left" w:pos="3544"/>
-                <w:tab w:val="left" w:pos="3828"/>
-                <w:tab w:val="left" w:pos="3969"/>
-                <w:tab w:val="left" w:pos="9214"/>
-                <w:tab w:val="left" w:pos="9923"/>
-              </w:tabs>
-              <w:jc w:val="center"/>
-              <w:rPr>
-                <w:sz w:val="22"/>
-                <w:szCs w:val="22"/>
-                <w:lang w:eastAsia="en-US"/>
-              </w:rPr>
-            </w:pPr>
-          </w:p>
-        </w:tc>
-      </w:tr>
-      <w:tr>
-        <w:tc>
-          <w:tcPr>
-            <w:tcW w:w="1011" w:type="dxa"/>
-            <w:vAlign w:val="center"/>
-          </w:tcPr>
-          <w:p>
-            <w:pPr>
-              <w:pStyle w:val="SemEspaamento"/>
-              <w:numPr>
-                <w:ilvl w:val="0"/>
-                <w:numId w:val="34"/>
-              </w:numPr>
-              <w:jc w:val="center"/>
-              <w:rPr>
-                <w:sz w:val="22"/>
-                <w:szCs w:val="22"/>
-                <w:lang w:eastAsia="en-US"/>
-              </w:rPr>
-            </w:pPr>
-          </w:p>
-        </w:tc>
-        <w:tc>
-          <w:tcPr>
-            <w:tcW w:w="1819" w:type="dxa"/>
-            <w:vAlign w:val="center"/>
-          </w:tcPr>
-          <w:p>
-            <w:pPr>
-              <w:tabs>
-                <w:tab w:val="center" w:pos="2632"/>
-              </w:tabs>
-              <w:jc w:val="center"/>
-              <w:rPr>
-                <w:bCs/>
-                <w:sz w:val="22"/>
-                <w:szCs w:val="22"/>
-                <w:lang w:eastAsia="en-US"/>
-              </w:rPr>
-            </w:pPr>
-          </w:p>
-        </w:tc>
-        <w:tc>
-          <w:tcPr>
-            <w:tcW w:w="6946" w:type="dxa"/>
-            <w:vAlign w:val="center"/>
-          </w:tcPr>
-          <w:p>
-            <w:pPr>
-              <w:tabs>
-                <w:tab w:val="left" w:pos="3544"/>
-                <w:tab w:val="left" w:pos="3828"/>
-                <w:tab w:val="left" w:pos="3969"/>
-                <w:tab w:val="left" w:pos="9214"/>
-                <w:tab w:val="left" w:pos="9923"/>
-              </w:tabs>
-              <w:jc w:val="center"/>
-              <w:rPr>
-                <w:b/>
-                <w:bCs/>
-                <w:sz w:val="22"/>
-                <w:szCs w:val="22"/>
-                <w:lang w:eastAsia="en-US"/>
-              </w:rPr>
-            </w:pPr>
-          </w:p>
-        </w:tc>
-      </w:tr>
-      <w:tr>
-        <w:tc>
-          <w:tcPr>
-            <w:tcW w:w="1011" w:type="dxa"/>
-            <w:vAlign w:val="center"/>
-          </w:tcPr>
-          <w:p>
-            <w:pPr>
-              <w:pStyle w:val="SemEspaamento"/>
-              <w:numPr>
-                <w:ilvl w:val="0"/>
-                <w:numId w:val="34"/>
-              </w:numPr>
-              <w:jc w:val="center"/>
-              <w:rPr>
-                <w:sz w:val="22"/>
-                <w:szCs w:val="22"/>
-                <w:lang w:eastAsia="en-US"/>
-              </w:rPr>
-            </w:pPr>
-          </w:p>
-        </w:tc>
-        <w:tc>
-          <w:tcPr>
-            <w:tcW w:w="1819" w:type="dxa"/>
-            <w:vAlign w:val="center"/>
-          </w:tcPr>
-          <w:p>
-            <w:pPr>
-              <w:tabs>
-                <w:tab w:val="center" w:pos="2632"/>
-              </w:tabs>
-              <w:jc w:val="center"/>
-              <w:rPr>
-                <w:bCs/>
-                <w:sz w:val="22"/>
-                <w:szCs w:val="22"/>
-                <w:lang w:eastAsia="en-US"/>
-              </w:rPr>
-            </w:pPr>
-          </w:p>
-        </w:tc>
-        <w:tc>
-          <w:tcPr>
-            <w:tcW w:w="6946" w:type="dxa"/>
-            <w:vAlign w:val="center"/>
-          </w:tcPr>
-          <w:p>
-            <w:pPr>
-              <w:tabs>
-                <w:tab w:val="left" w:pos="3544"/>
-                <w:tab w:val="left" w:pos="3828"/>
-                <w:tab w:val="left" w:pos="3969"/>
-                <w:tab w:val="left" w:pos="9214"/>
-                <w:tab w:val="left" w:pos="9923"/>
-              </w:tabs>
-              <w:jc w:val="center"/>
-              <w:rPr>
-                <w:b/>
-                <w:bCs/>
-                <w:sz w:val="22"/>
-                <w:szCs w:val="22"/>
-                <w:lang w:eastAsia="en-US"/>
-              </w:rPr>
-            </w:pPr>
-          </w:p>
-        </w:tc>
-      </w:tr>
-      <w:tr>
-        <w:tc>
-          <w:tcPr>
-            <w:tcW w:w="1011" w:type="dxa"/>
-            <w:vAlign w:val="center"/>
-          </w:tcPr>
-          <w:p>
-            <w:pPr>
-              <w:pStyle w:val="SemEspaamento"/>
-              <w:numPr>
-                <w:ilvl w:val="0"/>
-                <w:numId w:val="34"/>
-              </w:numPr>
-              <w:jc w:val="center"/>
-              <w:rPr>
-                <w:sz w:val="22"/>
-                <w:szCs w:val="22"/>
-                <w:lang w:eastAsia="en-US"/>
-              </w:rPr>
-            </w:pPr>
-          </w:p>
-        </w:tc>
-        <w:tc>
-          <w:tcPr>
-            <w:tcW w:w="1819" w:type="dxa"/>
-            <w:vAlign w:val="center"/>
-          </w:tcPr>
-          <w:p>
-            <w:pPr>
-              <w:tabs>
-                <w:tab w:val="center" w:pos="2632"/>
-              </w:tabs>
-              <w:jc w:val="center"/>
-              <w:rPr>
-                <w:bCs/>
-                <w:sz w:val="22"/>
-                <w:szCs w:val="22"/>
-                <w:lang w:eastAsia="en-US"/>
-              </w:rPr>
-            </w:pPr>
-          </w:p>
-        </w:tc>
-        <w:tc>
-          <w:tcPr>
-            <w:tcW w:w="6946" w:type="dxa"/>
-            <w:vAlign w:val="center"/>
-          </w:tcPr>
-          <w:p>
-            <w:pPr>
-              <w:tabs>
-                <w:tab w:val="left" w:pos="3544"/>
-                <w:tab w:val="left" w:pos="3828"/>
-                <w:tab w:val="left" w:pos="3969"/>
-                <w:tab w:val="left" w:pos="9214"/>
-                <w:tab w:val="left" w:pos="9923"/>
-              </w:tabs>
-              <w:jc w:val="center"/>
-              <w:rPr>
-                <w:sz w:val="22"/>
-                <w:szCs w:val="22"/>
-                <w:lang w:eastAsia="en-US"/>
-              </w:rPr>
-            </w:pPr>
-          </w:p>
-        </w:tc>
-      </w:tr>
-      <w:tr>
-        <w:tc>
-          <w:tcPr>
-            <w:tcW w:w="1011" w:type="dxa"/>
-            <w:vAlign w:val="center"/>
-          </w:tcPr>
-          <w:p>
-            <w:pPr>
-              <w:pStyle w:val="SemEspaamento"/>
-              <w:numPr>
-                <w:ilvl w:val="0"/>
-                <w:numId w:val="34"/>
-              </w:numPr>
-              <w:jc w:val="center"/>
-              <w:rPr>
-                <w:sz w:val="22"/>
-                <w:szCs w:val="22"/>
-                <w:lang w:eastAsia="en-US"/>
-              </w:rPr>
-            </w:pPr>
-          </w:p>
-        </w:tc>
-        <w:tc>
-          <w:tcPr>
-            <w:tcW w:w="1819" w:type="dxa"/>
-            <w:vAlign w:val="center"/>
-          </w:tcPr>
-          <w:p>
-            <w:pPr>
-              <w:tabs>
-                <w:tab w:val="center" w:pos="2632"/>
-              </w:tabs>
-              <w:jc w:val="center"/>
-              <w:rPr>
-                <w:bCs/>
-                <w:sz w:val="22"/>
-                <w:szCs w:val="22"/>
-                <w:lang w:eastAsia="en-US"/>
-              </w:rPr>
-            </w:pPr>
-          </w:p>
-        </w:tc>
-        <w:tc>
-          <w:tcPr>
-            <w:tcW w:w="6946" w:type="dxa"/>
-            <w:vAlign w:val="center"/>
-          </w:tcPr>
-          <w:p>
-            <w:pPr>
-              <w:tabs>
-                <w:tab w:val="left" w:pos="3544"/>
-                <w:tab w:val="left" w:pos="3828"/>
-                <w:tab w:val="left" w:pos="3969"/>
-                <w:tab w:val="left" w:pos="9214"/>
-                <w:tab w:val="left" w:pos="9923"/>
-              </w:tabs>
-              <w:jc w:val="center"/>
-              <w:rPr>
-                <w:sz w:val="22"/>
-                <w:szCs w:val="22"/>
-                <w:lang w:eastAsia="en-US"/>
-              </w:rPr>
-            </w:pPr>
-          </w:p>
-        </w:tc>
-      </w:tr>
-      <w:tr>
-        <w:tc>
-          <w:tcPr>
-            <w:tcW w:w="1011" w:type="dxa"/>
-            <w:vAlign w:val="center"/>
-          </w:tcPr>
-          <w:p>
-            <w:pPr>
-              <w:pStyle w:val="SemEspaamento"/>
-              <w:numPr>
-                <w:ilvl w:val="0"/>
-                <w:numId w:val="34"/>
-              </w:numPr>
-              <w:jc w:val="center"/>
-              <w:rPr>
-                <w:sz w:val="22"/>
-                <w:szCs w:val="22"/>
-                <w:lang w:eastAsia="en-US"/>
-              </w:rPr>
-            </w:pPr>
-          </w:p>
-        </w:tc>
-        <w:tc>
-          <w:tcPr>
-            <w:tcW w:w="1819" w:type="dxa"/>
-            <w:vAlign w:val="center"/>
-          </w:tcPr>
-          <w:p>
-            <w:pPr>
-              <w:tabs>
-                <w:tab w:val="center" w:pos="2632"/>
-              </w:tabs>
-              <w:jc w:val="center"/>
-              <w:rPr>
-                <w:bCs/>
-                <w:sz w:val="22"/>
-                <w:szCs w:val="22"/>
-                <w:lang w:eastAsia="en-US"/>
-              </w:rPr>
-            </w:pPr>
-          </w:p>
-        </w:tc>
-        <w:tc>
-          <w:tcPr>
-            <w:tcW w:w="6946" w:type="dxa"/>
-            <w:vAlign w:val="center"/>
-          </w:tcPr>
-          <w:p>
-            <w:pPr>
-              <w:tabs>
-                <w:tab w:val="left" w:pos="3544"/>
-                <w:tab w:val="left" w:pos="3828"/>
-                <w:tab w:val="left" w:pos="3969"/>
-                <w:tab w:val="left" w:pos="9214"/>
-                <w:tab w:val="left" w:pos="9923"/>
-              </w:tabs>
-              <w:jc w:val="center"/>
-              <w:rPr>
-                <w:sz w:val="22"/>
-                <w:szCs w:val="22"/>
-                <w:lang w:eastAsia="en-US"/>
-              </w:rPr>
-            </w:pPr>
-          </w:p>
-        </w:tc>
-      </w:tr>
-      <w:tr>
-        <w:tc>
-          <w:tcPr>
-            <w:tcW w:w="1011" w:type="dxa"/>
-            <w:vAlign w:val="center"/>
-          </w:tcPr>
-          <w:p>
-            <w:pPr>
-              <w:pStyle w:val="SemEspaamento"/>
-              <w:numPr>
-                <w:ilvl w:val="0"/>
-                <w:numId w:val="34"/>
-              </w:numPr>
-              <w:jc w:val="center"/>
-              <w:rPr>
-                <w:sz w:val="22"/>
-                <w:szCs w:val="22"/>
-                <w:lang w:eastAsia="en-US"/>
-              </w:rPr>
-            </w:pPr>
-          </w:p>
-        </w:tc>
-        <w:tc>
-          <w:tcPr>
-            <w:tcW w:w="1819" w:type="dxa"/>
-            <w:vAlign w:val="center"/>
-          </w:tcPr>
-          <w:p>
-            <w:pPr>
-              <w:tabs>
-                <w:tab w:val="center" w:pos="2632"/>
-              </w:tabs>
-              <w:jc w:val="center"/>
-              <w:rPr>
-                <w:bCs/>
-                <w:sz w:val="22"/>
-                <w:szCs w:val="22"/>
-                <w:lang w:eastAsia="en-US"/>
-              </w:rPr>
-            </w:pPr>
-          </w:p>
-        </w:tc>
-        <w:tc>
-          <w:tcPr>
-            <w:tcW w:w="6946" w:type="dxa"/>
-            <w:vAlign w:val="center"/>
-          </w:tcPr>
-          <w:p>
-            <w:pPr>
-              <w:tabs>
-                <w:tab w:val="left" w:pos="3544"/>
-                <w:tab w:val="left" w:pos="3828"/>
-                <w:tab w:val="left" w:pos="3969"/>
-                <w:tab w:val="left" w:pos="9214"/>
-                <w:tab w:val="left" w:pos="9923"/>
-              </w:tabs>
-              <w:jc w:val="center"/>
-              <w:rPr>
-                <w:sz w:val="22"/>
-                <w:szCs w:val="22"/>
-                <w:lang w:eastAsia="en-US"/>
-              </w:rPr>
-            </w:pPr>
-          </w:p>
-        </w:tc>
-      </w:tr>
-      <w:tr>
-        <w:tc>
-          <w:tcPr>
-            <w:tcW w:w="1011" w:type="dxa"/>
-            <w:vAlign w:val="center"/>
-          </w:tcPr>
-          <w:p>
-            <w:pPr>
-              <w:pStyle w:val="SemEspaamento"/>
-              <w:numPr>
-                <w:ilvl w:val="0"/>
-                <w:numId w:val="34"/>
-              </w:numPr>
-              <w:jc w:val="center"/>
-              <w:rPr>
-                <w:sz w:val="22"/>
-                <w:szCs w:val="22"/>
-                <w:lang w:eastAsia="en-US"/>
-              </w:rPr>
-            </w:pPr>
-          </w:p>
-        </w:tc>
-        <w:tc>
-          <w:tcPr>
-            <w:tcW w:w="1819" w:type="dxa"/>
-            <w:vAlign w:val="center"/>
-          </w:tcPr>
-          <w:p>
-            <w:pPr>
-              <w:tabs>
-                <w:tab w:val="center" w:pos="2632"/>
-              </w:tabs>
-              <w:jc w:val="center"/>
-              <w:rPr>
-                <w:bCs/>
-                <w:sz w:val="22"/>
-                <w:szCs w:val="22"/>
-                <w:lang w:eastAsia="en-US"/>
-              </w:rPr>
-            </w:pPr>
-          </w:p>
-        </w:tc>
-        <w:tc>
-          <w:tcPr>
-            <w:tcW w:w="6946" w:type="dxa"/>
-            <w:vAlign w:val="center"/>
-          </w:tcPr>
-          <w:p>
-            <w:pPr>
-              <w:tabs>
-                <w:tab w:val="left" w:pos="3544"/>
-                <w:tab w:val="left" w:pos="3828"/>
-                <w:tab w:val="left" w:pos="3969"/>
-                <w:tab w:val="left" w:pos="9214"/>
-                <w:tab w:val="left" w:pos="9923"/>
-              </w:tabs>
-              <w:jc w:val="center"/>
-              <w:rPr>
-                <w:sz w:val="22"/>
-                <w:szCs w:val="22"/>
-                <w:lang w:eastAsia="en-US"/>
-              </w:rPr>
-            </w:pPr>
-          </w:p>
-        </w:tc>
-      </w:tr>
-      <w:tr>
-        <w:tc>
-          <w:tcPr>
-            <w:tcW w:w="1011" w:type="dxa"/>
-            <w:vAlign w:val="center"/>
-          </w:tcPr>
-          <w:p>
-            <w:pPr>
-              <w:pStyle w:val="SemEspaamento"/>
-              <w:numPr>
-                <w:ilvl w:val="0"/>
-                <w:numId w:val="34"/>
-              </w:numPr>
-              <w:jc w:val="center"/>
-              <w:rPr>
-                <w:sz w:val="22"/>
-                <w:szCs w:val="22"/>
-                <w:lang w:eastAsia="en-US"/>
-              </w:rPr>
-            </w:pPr>
-          </w:p>
-        </w:tc>
-        <w:tc>
-          <w:tcPr>
-            <w:tcW w:w="1819" w:type="dxa"/>
-            <w:vAlign w:val="center"/>
-          </w:tcPr>
-          <w:p>
-            <w:pPr>
-              <w:tabs>
-                <w:tab w:val="center" w:pos="2632"/>
-              </w:tabs>
-              <w:jc w:val="center"/>
-              <w:rPr>
-                <w:bCs/>
-                <w:sz w:val="22"/>
-                <w:szCs w:val="22"/>
-                <w:lang w:eastAsia="en-US"/>
-              </w:rPr>
-            </w:pPr>
-          </w:p>
-        </w:tc>
-        <w:tc>
-          <w:tcPr>
-            <w:tcW w:w="6946" w:type="dxa"/>
-            <w:vAlign w:val="center"/>
-          </w:tcPr>
-          <w:p>
-            <w:pPr>
-              <w:tabs>
-                <w:tab w:val="left" w:pos="3544"/>
-                <w:tab w:val="left" w:pos="3828"/>
-                <w:tab w:val="left" w:pos="3969"/>
-                <w:tab w:val="left" w:pos="9214"/>
-                <w:tab w:val="left" w:pos="9923"/>
-              </w:tabs>
-              <w:jc w:val="center"/>
-              <w:rPr>
-                <w:sz w:val="22"/>
-                <w:szCs w:val="22"/>
-                <w:lang w:eastAsia="en-US"/>
-              </w:rPr>
-            </w:pPr>
-          </w:p>
-        </w:tc>
-      </w:tr>
-      <w:tr>
-        <w:tc>
-          <w:tcPr>
-            <w:tcW w:w="1011" w:type="dxa"/>
-            <w:vAlign w:val="center"/>
-          </w:tcPr>
-          <w:p>
-            <w:pPr>
-              <w:pStyle w:val="SemEspaamento"/>
-              <w:numPr>
-                <w:ilvl w:val="0"/>
-                <w:numId w:val="34"/>
-              </w:numPr>
-              <w:jc w:val="center"/>
-              <w:rPr>
-                <w:sz w:val="22"/>
-                <w:szCs w:val="22"/>
-                <w:lang w:eastAsia="en-US"/>
-              </w:rPr>
-            </w:pPr>
-          </w:p>
-        </w:tc>
-        <w:tc>
-          <w:tcPr>
-            <w:tcW w:w="1819" w:type="dxa"/>
-            <w:vAlign w:val="center"/>
-          </w:tcPr>
-          <w:p>
-            <w:pPr>
-              <w:tabs>
-                <w:tab w:val="center" w:pos="2632"/>
-              </w:tabs>
-              <w:jc w:val="center"/>
-              <w:rPr>
-                <w:bCs/>
-                <w:sz w:val="22"/>
-                <w:szCs w:val="22"/>
-                <w:lang w:eastAsia="en-US"/>
-              </w:rPr>
-            </w:pPr>
-          </w:p>
-        </w:tc>
-        <w:tc>
-          <w:tcPr>
-            <w:tcW w:w="6946" w:type="dxa"/>
-            <w:vAlign w:val="center"/>
-          </w:tcPr>
-          <w:p>
-            <w:pPr>
-              <w:tabs>
-                <w:tab w:val="left" w:pos="3544"/>
-                <w:tab w:val="left" w:pos="3828"/>
-                <w:tab w:val="left" w:pos="3969"/>
-                <w:tab w:val="left" w:pos="9214"/>
-                <w:tab w:val="left" w:pos="9923"/>
-              </w:tabs>
-              <w:jc w:val="center"/>
-              <w:rPr>
-                <w:sz w:val="22"/>
-                <w:szCs w:val="22"/>
-                <w:lang w:eastAsia="en-US"/>
-              </w:rPr>
-            </w:pPr>
-          </w:p>
-        </w:tc>
-      </w:tr>
-      <w:tr>
-        <w:tc>
-          <w:tcPr>
-            <w:tcW w:w="1011" w:type="dxa"/>
-            <w:vAlign w:val="center"/>
-          </w:tcPr>
-          <w:p>
-            <w:pPr>
-              <w:pStyle w:val="SemEspaamento"/>
-              <w:numPr>
-                <w:ilvl w:val="0"/>
-                <w:numId w:val="34"/>
-              </w:numPr>
-              <w:jc w:val="center"/>
-              <w:rPr>
-                <w:sz w:val="22"/>
-                <w:szCs w:val="22"/>
-                <w:lang w:eastAsia="en-US"/>
-              </w:rPr>
-            </w:pPr>
-          </w:p>
-        </w:tc>
-        <w:tc>
-          <w:tcPr>
-            <w:tcW w:w="1819" w:type="dxa"/>
-            <w:vAlign w:val="center"/>
-          </w:tcPr>
-          <w:p>
-            <w:pPr>
-              <w:tabs>
-                <w:tab w:val="center" w:pos="2632"/>
-              </w:tabs>
-              <w:jc w:val="center"/>
-              <w:rPr>
-                <w:bCs/>
-                <w:sz w:val="22"/>
-                <w:szCs w:val="22"/>
-                <w:lang w:eastAsia="en-US"/>
-              </w:rPr>
-            </w:pPr>
-          </w:p>
-        </w:tc>
-        <w:tc>
-          <w:tcPr>
-            <w:tcW w:w="6946" w:type="dxa"/>
-            <w:vAlign w:val="center"/>
-          </w:tcPr>
-          <w:p>
-            <w:pPr>
-              <w:tabs>
-                <w:tab w:val="left" w:pos="3544"/>
-                <w:tab w:val="left" w:pos="3828"/>
-                <w:tab w:val="left" w:pos="3969"/>
-                <w:tab w:val="left" w:pos="9214"/>
-                <w:tab w:val="left" w:pos="9923"/>
-              </w:tabs>
-              <w:jc w:val="center"/>
-              <w:rPr>
-                <w:sz w:val="22"/>
-                <w:szCs w:val="22"/>
-                <w:lang w:eastAsia="en-US"/>
-              </w:rPr>
-            </w:pPr>
-          </w:p>
-        </w:tc>
-      </w:tr>
-      <w:tr>
-        <w:tc>
-          <w:tcPr>
-            <w:tcW w:w="1011" w:type="dxa"/>
-            <w:vAlign w:val="center"/>
-          </w:tcPr>
-          <w:p>
-            <w:pPr>
-              <w:pStyle w:val="SemEspaamento"/>
-              <w:numPr>
-                <w:ilvl w:val="0"/>
-                <w:numId w:val="34"/>
-              </w:numPr>
-              <w:jc w:val="center"/>
-              <w:rPr>
-                <w:sz w:val="22"/>
-                <w:szCs w:val="22"/>
-                <w:lang w:eastAsia="en-US"/>
-              </w:rPr>
-            </w:pPr>
-          </w:p>
-        </w:tc>
-        <w:tc>
-          <w:tcPr>
-            <w:tcW w:w="1819" w:type="dxa"/>
-            <w:vAlign w:val="center"/>
-          </w:tcPr>
-          <w:p>
-            <w:pPr>
-              <w:tabs>
-                <w:tab w:val="center" w:pos="2632"/>
-              </w:tabs>
-              <w:jc w:val="center"/>
-              <w:rPr>
-                <w:bCs/>
-                <w:sz w:val="22"/>
-                <w:szCs w:val="22"/>
-                <w:lang w:eastAsia="en-US"/>
-              </w:rPr>
-            </w:pPr>
-            <w:r>
-              <w:rPr>
-                <w:bCs/>
-                <w:sz w:val="22"/>
-                <w:szCs w:val="22"/>
-                <w:lang w:eastAsia="en-US"/>
-              </w:rPr>
-              <w:t>SD QPBM</w:t>
-            </w:r>
-          </w:p>
-        </w:tc>
-        <w:tc>
-          <w:tcPr>
-            <w:tcW w:w="6946" w:type="dxa"/>
-            <w:vAlign w:val="center"/>
-          </w:tcPr>
-          <w:p>
-            <w:pPr>
-              <w:tabs>
-                <w:tab w:val="left" w:pos="3544"/>
-                <w:tab w:val="left" w:pos="3828"/>
-                <w:tab w:val="left" w:pos="3969"/>
-                <w:tab w:val="left" w:pos="9214"/>
-                <w:tab w:val="left" w:pos="9923"/>
-              </w:tabs>
-              <w:jc w:val="center"/>
-              <w:rPr>
-                <w:sz w:val="22"/>
-                <w:szCs w:val="22"/>
-                <w:lang w:eastAsia="en-US"/>
-              </w:rPr>
-            </w:pPr>
-          </w:p>
-        </w:tc>
-      </w:tr>
-      <w:tr>
-        <w:tc>
-          <w:tcPr>
-            <w:tcW w:w="1011" w:type="dxa"/>
-            <w:vAlign w:val="center"/>
-          </w:tcPr>
-          <w:p>
-            <w:pPr>
-              <w:pStyle w:val="SemEspaamento"/>
-              <w:numPr>
-                <w:ilvl w:val="0"/>
-                <w:numId w:val="34"/>
-              </w:numPr>
-              <w:jc w:val="center"/>
-              <w:rPr>
-                <w:sz w:val="22"/>
-                <w:szCs w:val="22"/>
-                <w:lang w:eastAsia="en-US"/>
-              </w:rPr>
-            </w:pPr>
-          </w:p>
-        </w:tc>
-        <w:tc>
-          <w:tcPr>
-            <w:tcW w:w="1819" w:type="dxa"/>
-            <w:vAlign w:val="center"/>
-          </w:tcPr>
-          <w:p>
-            <w:pPr>
-              <w:tabs>
-                <w:tab w:val="center" w:pos="2632"/>
-              </w:tabs>
-              <w:jc w:val="center"/>
-              <w:rPr>
-                <w:bCs/>
-                <w:sz w:val="22"/>
-                <w:szCs w:val="22"/>
-                <w:lang w:eastAsia="en-US"/>
-              </w:rPr>
-            </w:pPr>
-            <w:r>
-              <w:rPr>
-                <w:bCs/>
-                <w:sz w:val="22"/>
-                <w:szCs w:val="22"/>
-                <w:lang w:eastAsia="en-US"/>
-              </w:rPr>
-              <w:t>SD QPBM</w:t>
-            </w:r>
-          </w:p>
-        </w:tc>
-        <w:tc>
-          <w:tcPr>
-            <w:tcW w:w="6946" w:type="dxa"/>
-            <w:vAlign w:val="center"/>
-          </w:tcPr>
-          <w:p>
-            <w:pPr>
-              <w:tabs>
-                <w:tab w:val="left" w:pos="3544"/>
-                <w:tab w:val="left" w:pos="3828"/>
-                <w:tab w:val="left" w:pos="3969"/>
-                <w:tab w:val="left" w:pos="9214"/>
-                <w:tab w:val="left" w:pos="9923"/>
-              </w:tabs>
-              <w:jc w:val="center"/>
-              <w:rPr>
-                <w:sz w:val="22"/>
-                <w:szCs w:val="22"/>
-                <w:lang w:val="es-ES" w:eastAsia="en-US"/>
-              </w:rPr>
-            </w:pPr>
-          </w:p>
-        </w:tc>
-      </w:tr>
-      <w:tr>
-        <w:tc>
-          <w:tcPr>
-            <w:tcW w:w="1011" w:type="dxa"/>
-            <w:vAlign w:val="center"/>
-          </w:tcPr>
-          <w:p>
-            <w:pPr>
-              <w:pStyle w:val="SemEspaamento"/>
-              <w:numPr>
-                <w:ilvl w:val="0"/>
-                <w:numId w:val="34"/>
-              </w:numPr>
-              <w:jc w:val="center"/>
-              <w:rPr>
-                <w:sz w:val="22"/>
-                <w:szCs w:val="22"/>
-                <w:lang w:val="es-ES" w:eastAsia="en-US"/>
-              </w:rPr>
-            </w:pPr>
-          </w:p>
-        </w:tc>
-        <w:tc>
-          <w:tcPr>
-            <w:tcW w:w="1819" w:type="dxa"/>
-            <w:vAlign w:val="center"/>
-          </w:tcPr>
-          <w:p>
-            <w:pPr>
-              <w:tabs>
-                <w:tab w:val="center" w:pos="2632"/>
-              </w:tabs>
-              <w:jc w:val="center"/>
-              <w:rPr>
-                <w:bCs/>
-                <w:sz w:val="22"/>
-                <w:szCs w:val="22"/>
-                <w:lang w:eastAsia="en-US"/>
-              </w:rPr>
-            </w:pPr>
-            <w:r>
-              <w:rPr>
-                <w:bCs/>
-                <w:sz w:val="22"/>
-                <w:szCs w:val="22"/>
-                <w:lang w:eastAsia="en-US"/>
-              </w:rPr>
-              <w:t>SD QPBM</w:t>
-            </w:r>
-          </w:p>
-        </w:tc>
-        <w:tc>
-          <w:tcPr>
-            <w:tcW w:w="6946" w:type="dxa"/>
-            <w:vAlign w:val="center"/>
-          </w:tcPr>
-          <w:p>
-            <w:pPr>
-              <w:tabs>
-                <w:tab w:val="left" w:pos="3544"/>
-                <w:tab w:val="left" w:pos="3828"/>
-                <w:tab w:val="left" w:pos="3969"/>
-                <w:tab w:val="left" w:pos="9214"/>
-                <w:tab w:val="left" w:pos="9923"/>
-              </w:tabs>
-              <w:jc w:val="center"/>
-              <w:rPr>
-                <w:sz w:val="22"/>
-                <w:szCs w:val="22"/>
-                <w:lang w:eastAsia="en-US"/>
-              </w:rPr>
-            </w:pPr>
-          </w:p>
-        </w:tc>
-      </w:tr>
-      <w:tr>
-        <w:tc>
-          <w:tcPr>
-            <w:tcW w:w="1011" w:type="dxa"/>
-            <w:vAlign w:val="center"/>
-          </w:tcPr>
-          <w:p>
-            <w:pPr>
-              <w:pStyle w:val="SemEspaamento"/>
-              <w:numPr>
-                <w:ilvl w:val="0"/>
-                <w:numId w:val="34"/>
-              </w:numPr>
-              <w:jc w:val="center"/>
-              <w:rPr>
-                <w:sz w:val="22"/>
-                <w:szCs w:val="22"/>
-                <w:lang w:eastAsia="en-US"/>
-              </w:rPr>
-            </w:pPr>
-          </w:p>
-        </w:tc>
-        <w:tc>
-          <w:tcPr>
-            <w:tcW w:w="1819" w:type="dxa"/>
-            <w:vAlign w:val="center"/>
-          </w:tcPr>
-          <w:p>
-            <w:pPr>
-              <w:tabs>
-                <w:tab w:val="center" w:pos="2632"/>
-              </w:tabs>
-              <w:jc w:val="center"/>
-              <w:rPr>
-                <w:bCs/>
-                <w:sz w:val="22"/>
-                <w:szCs w:val="22"/>
-                <w:lang w:eastAsia="en-US"/>
-              </w:rPr>
-            </w:pPr>
-            <w:r>
-              <w:rPr>
-                <w:bCs/>
-                <w:sz w:val="22"/>
-                <w:szCs w:val="22"/>
-                <w:lang w:eastAsia="en-US"/>
-              </w:rPr>
-              <w:t>SD QPBM</w:t>
-            </w:r>
-          </w:p>
-        </w:tc>
-        <w:tc>
-          <w:tcPr>
-            <w:tcW w:w="6946" w:type="dxa"/>
-            <w:vAlign w:val="center"/>
-          </w:tcPr>
-          <w:p>
-            <w:pPr>
-              <w:tabs>
-                <w:tab w:val="left" w:pos="3544"/>
-                <w:tab w:val="left" w:pos="3828"/>
-                <w:tab w:val="left" w:pos="3969"/>
-                <w:tab w:val="left" w:pos="9214"/>
-                <w:tab w:val="left" w:pos="9923"/>
-              </w:tabs>
-              <w:jc w:val="center"/>
-              <w:rPr>
-                <w:sz w:val="22"/>
-                <w:szCs w:val="22"/>
-                <w:lang w:eastAsia="en-US"/>
-              </w:rPr>
-            </w:pPr>
-          </w:p>
-        </w:tc>
-      </w:tr>
-      <w:tr>
-        <w:tc>
-          <w:tcPr>
-            <w:tcW w:w="1011" w:type="dxa"/>
-            <w:vAlign w:val="center"/>
-          </w:tcPr>
-          <w:p>
-            <w:pPr>
-              <w:pStyle w:val="SemEspaamento"/>
-              <w:numPr>
-                <w:ilvl w:val="0"/>
-                <w:numId w:val="34"/>
-              </w:numPr>
-              <w:jc w:val="center"/>
-              <w:rPr>
-                <w:sz w:val="22"/>
-                <w:szCs w:val="22"/>
-                <w:lang w:eastAsia="en-US"/>
-              </w:rPr>
-            </w:pPr>
-          </w:p>
-        </w:tc>
-        <w:tc>
-          <w:tcPr>
-            <w:tcW w:w="1819" w:type="dxa"/>
-            <w:vAlign w:val="center"/>
-          </w:tcPr>
-          <w:p>
-            <w:pPr>
-              <w:tabs>
-                <w:tab w:val="center" w:pos="2632"/>
-              </w:tabs>
-              <w:jc w:val="center"/>
-              <w:rPr>
-                <w:bCs/>
-                <w:sz w:val="22"/>
-                <w:szCs w:val="22"/>
-                <w:lang w:eastAsia="en-US"/>
-              </w:rPr>
-            </w:pPr>
-            <w:r>
-              <w:rPr>
-                <w:bCs/>
-                <w:sz w:val="22"/>
-                <w:szCs w:val="22"/>
-                <w:lang w:eastAsia="en-US"/>
-              </w:rPr>
-              <w:t>SD QPBM</w:t>
-            </w:r>
-          </w:p>
-        </w:tc>
-        <w:tc>
-          <w:tcPr>
-            <w:tcW w:w="6946" w:type="dxa"/>
-            <w:vAlign w:val="center"/>
-          </w:tcPr>
-          <w:p>
-            <w:pPr>
-              <w:tabs>
-                <w:tab w:val="left" w:pos="3544"/>
-                <w:tab w:val="left" w:pos="3828"/>
-                <w:tab w:val="left" w:pos="3969"/>
-                <w:tab w:val="left" w:pos="9214"/>
-                <w:tab w:val="left" w:pos="9923"/>
-              </w:tabs>
-              <w:jc w:val="center"/>
-              <w:rPr>
-                <w:sz w:val="22"/>
-                <w:szCs w:val="22"/>
-                <w:lang w:eastAsia="en-US"/>
-              </w:rPr>
-            </w:pPr>
-          </w:p>
-        </w:tc>
-      </w:tr>
-      <w:tr>
-        <w:tc>
-          <w:tcPr>
-            <w:tcW w:w="1011" w:type="dxa"/>
-            <w:vAlign w:val="center"/>
-          </w:tcPr>
-          <w:p>
-            <w:pPr>
-              <w:pStyle w:val="SemEspaamento"/>
-              <w:numPr>
-                <w:ilvl w:val="0"/>
-                <w:numId w:val="34"/>
-              </w:numPr>
-              <w:jc w:val="center"/>
-              <w:rPr>
-                <w:sz w:val="22"/>
-                <w:szCs w:val="22"/>
-                <w:lang w:eastAsia="en-US"/>
-              </w:rPr>
-            </w:pPr>
-          </w:p>
-        </w:tc>
-        <w:tc>
-          <w:tcPr>
-            <w:tcW w:w="1819" w:type="dxa"/>
-            <w:vAlign w:val="center"/>
-          </w:tcPr>
-          <w:p>
-            <w:pPr>
-              <w:tabs>
-                <w:tab w:val="center" w:pos="2632"/>
-              </w:tabs>
-              <w:jc w:val="center"/>
-              <w:rPr>
-                <w:bCs/>
-                <w:sz w:val="22"/>
-                <w:szCs w:val="22"/>
-                <w:lang w:eastAsia="en-US"/>
-              </w:rPr>
-            </w:pPr>
-            <w:r>
-              <w:rPr>
-                <w:bCs/>
-                <w:sz w:val="22"/>
-                <w:szCs w:val="22"/>
-                <w:lang w:eastAsia="en-US"/>
-              </w:rPr>
-              <w:t>SD QPBM</w:t>
-            </w:r>
-          </w:p>
-        </w:tc>
-        <w:tc>
-          <w:tcPr>
-            <w:tcW w:w="6946" w:type="dxa"/>
-            <w:vAlign w:val="center"/>
-          </w:tcPr>
-          <w:p>
-            <w:pPr>
-              <w:tabs>
-                <w:tab w:val="left" w:pos="3544"/>
-                <w:tab w:val="left" w:pos="3828"/>
-                <w:tab w:val="left" w:pos="3969"/>
-                <w:tab w:val="left" w:pos="9214"/>
-                <w:tab w:val="left" w:pos="9923"/>
-              </w:tabs>
-              <w:jc w:val="center"/>
-              <w:rPr>
-                <w:sz w:val="22"/>
-                <w:szCs w:val="22"/>
-                <w:lang w:eastAsia="en-US"/>
-              </w:rPr>
-            </w:pPr>
-          </w:p>
-        </w:tc>
-      </w:tr>
-      <w:tr>
-        <w:tc>
-          <w:tcPr>
-            <w:tcW w:w="1011" w:type="dxa"/>
-            <w:vAlign w:val="center"/>
-          </w:tcPr>
-          <w:p>
-            <w:pPr>
-              <w:pStyle w:val="SemEspaamento"/>
-              <w:numPr>
-                <w:ilvl w:val="0"/>
-                <w:numId w:val="34"/>
-              </w:numPr>
-              <w:jc w:val="center"/>
-              <w:rPr>
-                <w:sz w:val="22"/>
-                <w:szCs w:val="22"/>
-                <w:lang w:eastAsia="en-US"/>
-              </w:rPr>
-            </w:pPr>
-          </w:p>
-        </w:tc>
-        <w:tc>
-          <w:tcPr>
-            <w:tcW w:w="1819" w:type="dxa"/>
-          </w:tcPr>
-          <w:p>
-            <w:pPr>
-              <w:tabs>
-                <w:tab w:val="center" w:pos="2632"/>
-              </w:tabs>
-              <w:jc w:val="center"/>
-              <w:rPr>
-                <w:bCs/>
-                <w:sz w:val="22"/>
-                <w:szCs w:val="22"/>
-                <w:lang w:eastAsia="en-US"/>
-              </w:rPr>
-            </w:pPr>
-            <w:r>
-              <w:rPr>
-                <w:bCs/>
-                <w:sz w:val="22"/>
-                <w:szCs w:val="22"/>
-                <w:lang w:eastAsia="en-US"/>
-              </w:rPr>
-              <w:t>SD QPBM</w:t>
-            </w:r>
-          </w:p>
-        </w:tc>
-        <w:tc>
-          <w:tcPr>
-            <w:tcW w:w="6946" w:type="dxa"/>
-            <w:vAlign w:val="center"/>
-          </w:tcPr>
-          <w:p>
-            <w:pPr>
-              <w:tabs>
-                <w:tab w:val="left" w:pos="3544"/>
-                <w:tab w:val="left" w:pos="3828"/>
-                <w:tab w:val="left" w:pos="3969"/>
-                <w:tab w:val="left" w:pos="9214"/>
-                <w:tab w:val="left" w:pos="9923"/>
-              </w:tabs>
-              <w:jc w:val="center"/>
-              <w:rPr>
-                <w:sz w:val="22"/>
-                <w:szCs w:val="22"/>
-                <w:lang w:eastAsia="en-US"/>
-              </w:rPr>
-            </w:pPr>
-          </w:p>
-        </w:tc>
-      </w:tr>
-      <w:tr>
-        <w:tc>
-          <w:tcPr>
-            <w:tcW w:w="1011" w:type="dxa"/>
-            <w:vAlign w:val="center"/>
-          </w:tcPr>
-          <w:p>
-            <w:pPr>
-              <w:pStyle w:val="SemEspaamento"/>
-              <w:numPr>
-                <w:ilvl w:val="0"/>
-                <w:numId w:val="34"/>
-              </w:numPr>
-              <w:jc w:val="center"/>
-              <w:rPr>
-                <w:sz w:val="22"/>
-                <w:szCs w:val="22"/>
-                <w:lang w:eastAsia="en-US"/>
-              </w:rPr>
-            </w:pPr>
-          </w:p>
-        </w:tc>
-        <w:tc>
-          <w:tcPr>
-            <w:tcW w:w="1819" w:type="dxa"/>
-          </w:tcPr>
-          <w:p>
-            <w:pPr>
-              <w:tabs>
-                <w:tab w:val="center" w:pos="2632"/>
-              </w:tabs>
-              <w:jc w:val="center"/>
-              <w:rPr>
-                <w:bCs/>
-                <w:sz w:val="22"/>
-                <w:szCs w:val="22"/>
-                <w:lang w:eastAsia="en-US"/>
-              </w:rPr>
-            </w:pPr>
-            <w:r>
-              <w:rPr>
-                <w:bCs/>
-                <w:sz w:val="22"/>
-                <w:szCs w:val="22"/>
-                <w:lang w:eastAsia="en-US"/>
-              </w:rPr>
-              <w:t>SD QPBM</w:t>
-            </w:r>
-          </w:p>
-        </w:tc>
-        <w:tc>
-          <w:tcPr>
-            <w:tcW w:w="6946" w:type="dxa"/>
-            <w:vAlign w:val="center"/>
-          </w:tcPr>
-          <w:p>
-            <w:pPr>
-              <w:tabs>
-                <w:tab w:val="left" w:pos="3544"/>
-                <w:tab w:val="left" w:pos="3828"/>
-                <w:tab w:val="left" w:pos="3969"/>
-                <w:tab w:val="left" w:pos="9214"/>
-                <w:tab w:val="left" w:pos="9923"/>
-              </w:tabs>
-              <w:jc w:val="center"/>
-              <w:rPr>
-                <w:sz w:val="22"/>
-                <w:szCs w:val="22"/>
-                <w:lang w:eastAsia="en-US"/>
-              </w:rPr>
-            </w:pPr>
-          </w:p>
-        </w:tc>
-      </w:tr>
-      <w:tr>
-        <w:tc>
-          <w:tcPr>
-            <w:tcW w:w="1011" w:type="dxa"/>
-            <w:vAlign w:val="center"/>
-          </w:tcPr>
-          <w:p>
-            <w:pPr>
-              <w:pStyle w:val="SemEspaamento"/>
-              <w:numPr>
-                <w:ilvl w:val="0"/>
-                <w:numId w:val="34"/>
-              </w:numPr>
-              <w:jc w:val="center"/>
-              <w:rPr>
-                <w:sz w:val="22"/>
-                <w:szCs w:val="22"/>
-                <w:lang w:eastAsia="en-US"/>
-              </w:rPr>
-            </w:pPr>
-          </w:p>
-        </w:tc>
-        <w:tc>
-          <w:tcPr>
-            <w:tcW w:w="1819" w:type="dxa"/>
-            <w:vAlign w:val="center"/>
-          </w:tcPr>
-          <w:p>
-            <w:pPr>
-              <w:tabs>
-                <w:tab w:val="center" w:pos="2632"/>
-              </w:tabs>
-              <w:jc w:val="center"/>
-              <w:rPr>
-                <w:bCs/>
-                <w:sz w:val="22"/>
-                <w:szCs w:val="22"/>
-                <w:lang w:eastAsia="en-US"/>
-              </w:rPr>
-            </w:pPr>
-            <w:r>
-              <w:rPr>
-                <w:bCs/>
-                <w:sz w:val="22"/>
-                <w:szCs w:val="22"/>
-                <w:lang w:eastAsia="en-US"/>
-              </w:rPr>
-              <w:t>SD QPBM</w:t>
-            </w:r>
-          </w:p>
-        </w:tc>
-        <w:tc>
-          <w:tcPr>
-            <w:tcW w:w="6946" w:type="dxa"/>
-            <w:vAlign w:val="center"/>
-          </w:tcPr>
-          <w:p>
-            <w:pPr>
-              <w:tabs>
-                <w:tab w:val="left" w:pos="3544"/>
-                <w:tab w:val="left" w:pos="3828"/>
-                <w:tab w:val="left" w:pos="3969"/>
-                <w:tab w:val="left" w:pos="9214"/>
-                <w:tab w:val="left" w:pos="9923"/>
-              </w:tabs>
-              <w:jc w:val="center"/>
-              <w:rPr>
-                <w:sz w:val="22"/>
-                <w:szCs w:val="22"/>
-                <w:lang w:eastAsia="en-US"/>
-              </w:rPr>
-            </w:pPr>
-          </w:p>
-        </w:tc>
-      </w:tr>
-      <w:tr>
-        <w:tc>
-          <w:tcPr>
-            <w:tcW w:w="1011" w:type="dxa"/>
-            <w:vAlign w:val="center"/>
-          </w:tcPr>
-          <w:p>
-            <w:pPr>
-              <w:pStyle w:val="SemEspaamento"/>
-              <w:numPr>
-                <w:ilvl w:val="0"/>
-                <w:numId w:val="34"/>
-              </w:numPr>
-              <w:jc w:val="center"/>
-              <w:rPr>
-                <w:sz w:val="22"/>
-                <w:szCs w:val="22"/>
-                <w:lang w:eastAsia="en-US"/>
-              </w:rPr>
-            </w:pPr>
-          </w:p>
-        </w:tc>
-        <w:tc>
-          <w:tcPr>
-            <w:tcW w:w="1819" w:type="dxa"/>
-            <w:vAlign w:val="center"/>
-          </w:tcPr>
-          <w:p>
-            <w:pPr>
-              <w:tabs>
-                <w:tab w:val="center" w:pos="2632"/>
-              </w:tabs>
-              <w:jc w:val="center"/>
-              <w:rPr>
-                <w:bCs/>
-                <w:sz w:val="22"/>
-                <w:szCs w:val="22"/>
-                <w:lang w:eastAsia="en-US"/>
-              </w:rPr>
-            </w:pPr>
-            <w:r>
-              <w:rPr>
-                <w:bCs/>
-                <w:sz w:val="22"/>
-                <w:szCs w:val="22"/>
-                <w:lang w:eastAsia="en-US"/>
-              </w:rPr>
-              <w:t>SD QPBM</w:t>
-            </w:r>
-          </w:p>
-        </w:tc>
-        <w:tc>
-          <w:tcPr>
-            <w:tcW w:w="6946" w:type="dxa"/>
-            <w:vAlign w:val="center"/>
-          </w:tcPr>
-          <w:p>
-            <w:pPr>
-              <w:tabs>
-                <w:tab w:val="left" w:pos="3544"/>
-                <w:tab w:val="left" w:pos="3828"/>
-                <w:tab w:val="left" w:pos="3969"/>
-                <w:tab w:val="left" w:pos="9214"/>
-                <w:tab w:val="left" w:pos="9923"/>
-              </w:tabs>
-              <w:jc w:val="center"/>
-              <w:rPr>
-                <w:b/>
-                <w:bCs/>
-                <w:sz w:val="22"/>
-                <w:szCs w:val="22"/>
-                <w:lang w:eastAsia="en-US"/>
-              </w:rPr>
-            </w:pPr>
-          </w:p>
-        </w:tc>
-      </w:tr>
-      <w:tr>
-        <w:tc>
-          <w:tcPr>
-            <w:tcW w:w="1011" w:type="dxa"/>
-            <w:vAlign w:val="center"/>
-          </w:tcPr>
-          <w:p>
-            <w:pPr>
-              <w:pStyle w:val="SemEspaamento"/>
-              <w:numPr>
-                <w:ilvl w:val="0"/>
-                <w:numId w:val="34"/>
-              </w:numPr>
-              <w:jc w:val="center"/>
-              <w:rPr>
-                <w:sz w:val="22"/>
-                <w:szCs w:val="22"/>
-                <w:lang w:eastAsia="en-US"/>
-              </w:rPr>
-            </w:pPr>
-          </w:p>
-        </w:tc>
-        <w:tc>
-          <w:tcPr>
-            <w:tcW w:w="1819" w:type="dxa"/>
-            <w:vAlign w:val="center"/>
-          </w:tcPr>
-          <w:p>
-            <w:pPr>
-              <w:tabs>
-                <w:tab w:val="center" w:pos="2632"/>
-              </w:tabs>
-              <w:jc w:val="center"/>
-              <w:rPr>
-                <w:bCs/>
-                <w:sz w:val="22"/>
-                <w:szCs w:val="22"/>
-                <w:lang w:eastAsia="en-US"/>
-              </w:rPr>
-            </w:pPr>
-            <w:r>
-              <w:rPr>
-                <w:bCs/>
-                <w:sz w:val="22"/>
-                <w:szCs w:val="22"/>
-                <w:lang w:eastAsia="en-US"/>
-              </w:rPr>
-              <w:t>SD QPBM</w:t>
-            </w:r>
-          </w:p>
-        </w:tc>
-        <w:tc>
-          <w:tcPr>
-            <w:tcW w:w="6946" w:type="dxa"/>
-            <w:vAlign w:val="center"/>
-          </w:tcPr>
-          <w:p>
-            <w:pPr>
-              <w:tabs>
-                <w:tab w:val="left" w:pos="3544"/>
-                <w:tab w:val="left" w:pos="3828"/>
-                <w:tab w:val="left" w:pos="3969"/>
-                <w:tab w:val="left" w:pos="9214"/>
-                <w:tab w:val="left" w:pos="9923"/>
-              </w:tabs>
-              <w:jc w:val="center"/>
-              <w:rPr>
-                <w:sz w:val="22"/>
-                <w:szCs w:val="22"/>
-                <w:lang w:eastAsia="en-US"/>
-              </w:rPr>
-            </w:pPr>
-          </w:p>
-        </w:tc>
-      </w:tr>
-      <w:tr>
-        <w:tc>
-          <w:tcPr>
-            <w:tcW w:w="1011" w:type="dxa"/>
-            <w:vAlign w:val="center"/>
-          </w:tcPr>
-          <w:p>
-            <w:pPr>
-              <w:pStyle w:val="SemEspaamento"/>
-              <w:numPr>
-                <w:ilvl w:val="0"/>
-                <w:numId w:val="34"/>
-              </w:numPr>
-              <w:jc w:val="center"/>
-              <w:rPr>
-                <w:sz w:val="22"/>
-                <w:szCs w:val="22"/>
-                <w:lang w:eastAsia="en-US"/>
-              </w:rPr>
-            </w:pPr>
-          </w:p>
-        </w:tc>
-        <w:tc>
-          <w:tcPr>
-            <w:tcW w:w="1819" w:type="dxa"/>
-            <w:vAlign w:val="center"/>
-          </w:tcPr>
-          <w:p>
-            <w:pPr>
-              <w:tabs>
-                <w:tab w:val="center" w:pos="2632"/>
-              </w:tabs>
-              <w:jc w:val="center"/>
-              <w:rPr>
-                <w:bCs/>
-                <w:sz w:val="22"/>
-                <w:szCs w:val="22"/>
-                <w:lang w:eastAsia="en-US"/>
-              </w:rPr>
-            </w:pPr>
-            <w:r>
-              <w:rPr>
-                <w:bCs/>
-                <w:sz w:val="22"/>
-                <w:szCs w:val="22"/>
-                <w:lang w:eastAsia="en-US"/>
-              </w:rPr>
-              <w:t>AL SD QPBM</w:t>
-            </w:r>
-          </w:p>
-        </w:tc>
-        <w:tc>
-          <w:tcPr>
-            <w:tcW w:w="6946" w:type="dxa"/>
-            <w:vAlign w:val="center"/>
-          </w:tcPr>
-          <w:p>
-            <w:pPr>
-              <w:tabs>
-                <w:tab w:val="left" w:pos="3544"/>
-                <w:tab w:val="left" w:pos="3828"/>
-                <w:tab w:val="left" w:pos="3969"/>
-                <w:tab w:val="left" w:pos="9214"/>
-                <w:tab w:val="left" w:pos="9923"/>
-              </w:tabs>
-              <w:jc w:val="center"/>
-              <w:rPr>
-                <w:sz w:val="22"/>
-                <w:szCs w:val="22"/>
-                <w:lang w:eastAsia="en-US"/>
-              </w:rPr>
-            </w:pPr>
-          </w:p>
-        </w:tc>
-      </w:tr>
-      <w:tr>
-        <w:tc>
-          <w:tcPr>
-            <w:tcW w:w="1011" w:type="dxa"/>
-            <w:vAlign w:val="center"/>
-          </w:tcPr>
-          <w:p>
-            <w:pPr>
-              <w:pStyle w:val="SemEspaamento"/>
-              <w:numPr>
-                <w:ilvl w:val="0"/>
-                <w:numId w:val="34"/>
-              </w:numPr>
-              <w:jc w:val="center"/>
-              <w:rPr>
-                <w:sz w:val="22"/>
-                <w:szCs w:val="22"/>
-                <w:lang w:eastAsia="en-US"/>
-              </w:rPr>
-            </w:pPr>
-          </w:p>
-        </w:tc>
-        <w:tc>
-          <w:tcPr>
-            <w:tcW w:w="1819" w:type="dxa"/>
-          </w:tcPr>
-          <w:p>
-            <w:pPr>
-              <w:tabs>
-                <w:tab w:val="center" w:pos="2632"/>
-              </w:tabs>
-              <w:jc w:val="center"/>
-              <w:rPr>
-                <w:bCs/>
-                <w:sz w:val="22"/>
-                <w:szCs w:val="22"/>
-                <w:lang w:eastAsia="en-US"/>
-              </w:rPr>
-            </w:pPr>
-            <w:r>
-              <w:rPr>
-                <w:bCs/>
-                <w:sz w:val="22"/>
-                <w:szCs w:val="22"/>
-                <w:lang w:eastAsia="en-US"/>
-              </w:rPr>
-              <w:t>AL SD QPBM</w:t>
-            </w:r>
-          </w:p>
-        </w:tc>
-        <w:tc>
-          <w:tcPr>
-            <w:tcW w:w="6946" w:type="dxa"/>
-            <w:vAlign w:val="center"/>
-          </w:tcPr>
-          <w:p>
-            <w:pPr>
-              <w:tabs>
-                <w:tab w:val="left" w:pos="3544"/>
-                <w:tab w:val="left" w:pos="3828"/>
-                <w:tab w:val="left" w:pos="3969"/>
-                <w:tab w:val="left" w:pos="9214"/>
-                <w:tab w:val="left" w:pos="9923"/>
-              </w:tabs>
-              <w:jc w:val="center"/>
-              <w:rPr>
-                <w:sz w:val="22"/>
-                <w:szCs w:val="22"/>
-                <w:lang w:eastAsia="en-US"/>
-              </w:rPr>
-            </w:pPr>
-          </w:p>
-        </w:tc>
-      </w:tr>
-      <w:tr>
-        <w:tc>
-          <w:tcPr>
-            <w:tcW w:w="1011" w:type="dxa"/>
-            <w:vAlign w:val="center"/>
-          </w:tcPr>
-          <w:p>
-            <w:pPr>
-              <w:pStyle w:val="SemEspaamento"/>
-              <w:numPr>
-                <w:ilvl w:val="0"/>
-                <w:numId w:val="34"/>
-              </w:numPr>
-              <w:jc w:val="center"/>
-              <w:rPr>
-                <w:sz w:val="22"/>
-                <w:szCs w:val="22"/>
-                <w:lang w:eastAsia="en-US"/>
-              </w:rPr>
-            </w:pPr>
-          </w:p>
-        </w:tc>
-        <w:tc>
-          <w:tcPr>
-            <w:tcW w:w="1819" w:type="dxa"/>
-          </w:tcPr>
-          <w:p>
-            <w:pPr>
-              <w:tabs>
-                <w:tab w:val="center" w:pos="2632"/>
-              </w:tabs>
-              <w:jc w:val="center"/>
-              <w:rPr>
-                <w:bCs/>
-                <w:sz w:val="22"/>
-                <w:szCs w:val="22"/>
-                <w:lang w:eastAsia="en-US"/>
-              </w:rPr>
-            </w:pPr>
-            <w:r>
-              <w:rPr>
-                <w:bCs/>
-                <w:sz w:val="22"/>
-                <w:szCs w:val="22"/>
-                <w:lang w:eastAsia="en-US"/>
-              </w:rPr>
-              <w:t>AL SD QPBM</w:t>
-            </w:r>
-          </w:p>
-        </w:tc>
-        <w:tc>
-          <w:tcPr>
-            <w:tcW w:w="6946" w:type="dxa"/>
-            <w:vAlign w:val="center"/>
-          </w:tcPr>
-          <w:p>
-            <w:pPr>
-              <w:tabs>
-                <w:tab w:val="left" w:pos="3544"/>
-                <w:tab w:val="left" w:pos="3828"/>
-                <w:tab w:val="left" w:pos="3969"/>
-                <w:tab w:val="left" w:pos="9214"/>
-                <w:tab w:val="left" w:pos="9923"/>
-              </w:tabs>
-              <w:jc w:val="center"/>
-              <w:rPr>
-                <w:sz w:val="22"/>
-                <w:szCs w:val="22"/>
-                <w:lang w:eastAsia="en-US"/>
-              </w:rPr>
-            </w:pPr>
-          </w:p>
-        </w:tc>
-      </w:tr>
-      <w:tr>
-        <w:tc>
-          <w:tcPr>
-            <w:tcW w:w="1011" w:type="dxa"/>
-            <w:vAlign w:val="center"/>
-          </w:tcPr>
-          <w:p>
-            <w:pPr>
-              <w:pStyle w:val="SemEspaamento"/>
-              <w:numPr>
-                <w:ilvl w:val="0"/>
-                <w:numId w:val="34"/>
-              </w:numPr>
-              <w:jc w:val="center"/>
-              <w:rPr>
-                <w:sz w:val="22"/>
-                <w:szCs w:val="22"/>
-                <w:lang w:eastAsia="en-US"/>
-              </w:rPr>
-            </w:pPr>
-          </w:p>
-        </w:tc>
-        <w:tc>
-          <w:tcPr>
-            <w:tcW w:w="1819" w:type="dxa"/>
-          </w:tcPr>
-          <w:p>
-            <w:pPr>
-              <w:tabs>
-                <w:tab w:val="center" w:pos="2632"/>
-              </w:tabs>
-              <w:jc w:val="center"/>
-              <w:rPr>
-                <w:bCs/>
-                <w:sz w:val="22"/>
-                <w:szCs w:val="22"/>
-                <w:lang w:eastAsia="en-US"/>
-              </w:rPr>
-            </w:pPr>
-            <w:r>
-              <w:rPr>
-                <w:bCs/>
-                <w:sz w:val="22"/>
-                <w:szCs w:val="22"/>
-                <w:lang w:eastAsia="en-US"/>
-              </w:rPr>
-              <w:t>AL SD QPBM</w:t>
-            </w:r>
-          </w:p>
-        </w:tc>
-        <w:tc>
-          <w:tcPr>
-            <w:tcW w:w="6946" w:type="dxa"/>
-            <w:vAlign w:val="center"/>
-          </w:tcPr>
-          <w:p>
-            <w:pPr>
-              <w:tabs>
-                <w:tab w:val="left" w:pos="3544"/>
-                <w:tab w:val="left" w:pos="3828"/>
-                <w:tab w:val="left" w:pos="3969"/>
-                <w:tab w:val="left" w:pos="9214"/>
-                <w:tab w:val="left" w:pos="9923"/>
-              </w:tabs>
-              <w:jc w:val="center"/>
-              <w:rPr>
-                <w:sz w:val="22"/>
-                <w:szCs w:val="22"/>
-                <w:lang w:eastAsia="en-US"/>
-              </w:rPr>
-            </w:pPr>
-          </w:p>
-        </w:tc>
-      </w:tr>
-      <w:tr>
-        <w:tc>
-          <w:tcPr>
-            <w:tcW w:w="1011" w:type="dxa"/>
-            <w:vAlign w:val="center"/>
-          </w:tcPr>
-          <w:p>
-            <w:pPr>
-              <w:pStyle w:val="SemEspaamento"/>
-              <w:numPr>
-                <w:ilvl w:val="0"/>
-                <w:numId w:val="34"/>
-              </w:numPr>
-              <w:jc w:val="center"/>
-              <w:rPr>
-                <w:sz w:val="22"/>
-                <w:szCs w:val="22"/>
-                <w:lang w:eastAsia="en-US"/>
-              </w:rPr>
-            </w:pPr>
-          </w:p>
-        </w:tc>
-        <w:tc>
-          <w:tcPr>
-            <w:tcW w:w="1819" w:type="dxa"/>
-          </w:tcPr>
-          <w:p>
-            <w:pPr>
-              <w:tabs>
-                <w:tab w:val="center" w:pos="2632"/>
-              </w:tabs>
-              <w:jc w:val="center"/>
-              <w:rPr>
-                <w:bCs/>
-                <w:sz w:val="22"/>
-                <w:szCs w:val="22"/>
-                <w:lang w:eastAsia="en-US"/>
-              </w:rPr>
-            </w:pPr>
-            <w:r>
-              <w:rPr>
-                <w:bCs/>
-                <w:sz w:val="22"/>
-                <w:szCs w:val="22"/>
-                <w:lang w:eastAsia="en-US"/>
-              </w:rPr>
-              <w:t>AL SD QPBM</w:t>
-            </w:r>
-          </w:p>
-        </w:tc>
-        <w:tc>
-          <w:tcPr>
-            <w:tcW w:w="6946" w:type="dxa"/>
-            <w:vAlign w:val="center"/>
-          </w:tcPr>
-          <w:p>
-            <w:pPr>
-              <w:tabs>
-                <w:tab w:val="left" w:pos="3544"/>
-                <w:tab w:val="left" w:pos="3828"/>
-                <w:tab w:val="left" w:pos="3969"/>
-                <w:tab w:val="left" w:pos="9214"/>
-                <w:tab w:val="left" w:pos="9923"/>
-              </w:tabs>
-              <w:jc w:val="center"/>
-              <w:rPr>
-                <w:sz w:val="22"/>
-                <w:szCs w:val="22"/>
-                <w:lang w:eastAsia="en-US"/>
-              </w:rPr>
-            </w:pPr>
-          </w:p>
-        </w:tc>
-      </w:tr>
     </w:tbl>
+    <w:p>
+      <w:pPr>
+        <w:tabs>
+          <w:tab w:val="left" w:pos="3544"/>
+          <w:tab w:val="left" w:pos="3828"/>
+          <w:tab w:val="left" w:pos="3969"/>
+          <w:tab w:val="left" w:pos="9214"/>
+          <w:tab w:val="left" w:pos="9923"/>
+        </w:tabs>
+        <w:ind w:right="-144"/>
+        <w:rPr>
+          <w:b/>
+          <w:color w:val="000000" w:themeColor="text1"/>
+          <w:sz w:val="22"/>
+          <w:szCs w:val="22"/>
+        </w:rPr>
+      </w:pPr>
+      <w:r>
+        <w:rPr>
+          <w:b/>
+          <w:color w:val="000000" w:themeColor="text1"/>
+          <w:sz w:val="22"/>
+          <w:szCs w:val="22"/>
+        </w:rPr>
+        <w:t>{%</w:t>
+      </w:r>
+      <w:proofErr w:type="spellStart"/>
+      <w:r>
+        <w:rPr>
+          <w:b/>
+          <w:color w:val="000000" w:themeColor="text1"/>
+          <w:sz w:val="22"/>
+          <w:szCs w:val="22"/>
+        </w:rPr>
+        <w:t>endif</w:t>
+      </w:r>
+      <w:proofErr w:type="spellEnd"/>
+      <w:r>
+        <w:rPr>
+          <w:b/>
+          <w:color w:val="000000" w:themeColor="text1"/>
+          <w:sz w:val="22"/>
+          <w:szCs w:val="22"/>
+        </w:rPr>
+        <w:t>%}</w:t>
+      </w:r>
+    </w:p>
     <w:p>
       <w:pPr>
         <w:tabs>
@@ -7993,9 +6268,17 @@
             <w:vAlign w:val="center"/>
           </w:tcPr>
           <w:p>
-            <w:r/>
             <w:r>
-              <w:t>{%tr for item in apto %}</w:t>
+              <w:lastRenderedPageBreak/>
+              <w:t>{%</w:t>
+            </w:r>
+            <w:proofErr w:type="spellStart"/>
+            <w:r>
+              <w:t>tr</w:t>
+            </w:r>
+            <w:proofErr w:type="spellEnd"/>
+            <w:r>
+              <w:t xml:space="preserve"> for item in apto %}</w:t>
             </w:r>
           </w:p>
         </w:tc>
@@ -8010,10 +6293,7 @@
             </w:tcBorders>
             <w:vAlign w:val="center"/>
           </w:tcPr>
-          <w:p>
-            <w:r/>
-            <w:r/>
-          </w:p>
+          <w:p/>
         </w:tc>
         <w:tc>
           <w:tcPr>
@@ -8025,10 +6305,7 @@
               <w:right w:val="single" w:sz="4" w:space="0" w:color="auto"/>
             </w:tcBorders>
           </w:tcPr>
-          <w:p>
-            <w:r/>
-            <w:r/>
-          </w:p>
+          <w:p/>
         </w:tc>
       </w:tr>
       <w:tr>
@@ -8048,7 +6325,6 @@
             <w:vAlign w:val="center"/>
           </w:tcPr>
           <w:p>
-            <w:r/>
             <w:r>
               <w:t>{{ item.posto_grad_quadro }}</w:t>
             </w:r>
@@ -8066,7 +6342,6 @@
             <w:vAlign w:val="center"/>
           </w:tcPr>
           <w:p>
-            <w:r/>
             <w:r>
               <w:t>{{ item.nome_completo }}</w:t>
             </w:r>
@@ -8083,7 +6358,6 @@
             </w:tcBorders>
           </w:tcPr>
           <w:p>
-            <w:r/>
             <w:r>
               <w:t>{{ item.rg }}</w:t>
             </w:r>
@@ -8107,7 +6381,6 @@
             <w:vAlign w:val="center"/>
           </w:tcPr>
           <w:p>
-            <w:r/>
             <w:r>
               <w:t>{%tr endfor %}</w:t>
             </w:r>
@@ -8124,10 +6397,7 @@
             </w:tcBorders>
             <w:vAlign w:val="center"/>
           </w:tcPr>
-          <w:p>
-            <w:r/>
-            <w:r/>
-          </w:p>
+          <w:p/>
         </w:tc>
         <w:tc>
           <w:tcPr>
@@ -8139,10 +6409,7 @@
               <w:right w:val="single" w:sz="4" w:space="0" w:color="auto"/>
             </w:tcBorders>
           </w:tcPr>
-          <w:p>
-            <w:r/>
-            <w:r/>
-          </w:p>
+          <w:p/>
         </w:tc>
       </w:tr>
     </w:tbl>
@@ -8188,6 +6455,33 @@
         </w:rPr>
         <w:t>%}</w:t>
       </w:r>
+      <w:r>
+        <w:rPr>
+          <w:color w:val="000000" w:themeColor="text1"/>
+          <w:sz w:val="22"/>
+          <w:szCs w:val="22"/>
+        </w:rPr>
+        <w:br/>
+        <w:t>{%</w:t>
+      </w:r>
+      <w:proofErr w:type="spellStart"/>
+      <w:r>
+        <w:rPr>
+          <w:color w:val="000000" w:themeColor="text1"/>
+          <w:sz w:val="22"/>
+          <w:szCs w:val="22"/>
+        </w:rPr>
+        <w:t>endif</w:t>
+      </w:r>
+      <w:proofErr w:type="spellEnd"/>
+      <w:r>
+        <w:rPr>
+          <w:color w:val="000000" w:themeColor="text1"/>
+          <w:sz w:val="22"/>
+          <w:szCs w:val="22"/>
+        </w:rPr>
+        <w:t>%}</w:t>
+      </w:r>
     </w:p>
     <w:p>
       <w:pPr>
@@ -8223,26 +6517,24 @@
         </w:rPr>
       </w:pPr>
       <w:r>
-        <w:t>APTO PARA O SERVIÇO DO CBMAM.</w:t>
-      </w:r>
-    </w:p>
-    <w:p>
-      <w:pPr>
-        <w:tabs>
-          <w:tab w:val="left" w:pos="3544"/>
-          <w:tab w:val="left" w:pos="3828"/>
-          <w:tab w:val="left" w:pos="3969"/>
-          <w:tab w:val="left" w:pos="9214"/>
-          <w:tab w:val="left" w:pos="9923"/>
-        </w:tabs>
-        <w:ind w:right="-144"/>
-        <w:rPr>
-          <w:b/>
-          <w:color w:val="000000" w:themeColor="text1"/>
-          <w:sz w:val="22"/>
-          <w:szCs w:val="22"/>
-        </w:rPr>
-      </w:pPr>
+        <w:t>{%</w:t>
+      </w:r>
+      <w:proofErr w:type="spellStart"/>
+      <w:r>
+        <w:t>if</w:t>
+      </w:r>
+      <w:proofErr w:type="spellEnd"/>
+      <w:r>
+        <w:t xml:space="preserve"> </w:t>
+      </w:r>
+      <w:proofErr w:type="spellStart"/>
+      <w:r>
+        <w:t>tem_apto_restr</w:t>
+      </w:r>
+      <w:proofErr w:type="spellEnd"/>
+      <w:r>
+        <w:t>%}</w:t>
+      </w:r>
     </w:p>
     <w:p>
       <w:pPr>
@@ -8345,26 +6637,6 @@
           <w:szCs w:val="22"/>
         </w:rPr>
         <w:t>.</w:t>
-      </w:r>
-    </w:p>
-    <w:p>
-      <w:pPr>
-        <w:tabs>
-          <w:tab w:val="left" w:pos="3544"/>
-          <w:tab w:val="left" w:pos="3828"/>
-          <w:tab w:val="left" w:pos="3969"/>
-          <w:tab w:val="left" w:pos="9214"/>
-          <w:tab w:val="left" w:pos="9923"/>
-        </w:tabs>
-        <w:ind w:right="141"/>
-        <w:jc w:val="both"/>
-        <w:rPr>
-          <w:sz w:val="22"/>
-          <w:szCs w:val="22"/>
-        </w:rPr>
-      </w:pPr>
-      <w:r>
-        <w:t>{%if tem_apto_restr%}</w:t>
       </w:r>
     </w:p>
     <w:tbl>
@@ -8534,7 +6806,6 @@
             <w:vAlign w:val="center"/>
           </w:tcPr>
           <w:p>
-            <w:r/>
             <w:r>
               <w:t>{%tr for item in apto_restr %}</w:t>
             </w:r>
@@ -8551,10 +6822,7 @@
             </w:tcBorders>
             <w:vAlign w:val="center"/>
           </w:tcPr>
-          <w:p>
-            <w:r/>
-            <w:r/>
-          </w:p>
+          <w:p/>
         </w:tc>
         <w:tc>
           <w:tcPr>
@@ -8566,10 +6834,7 @@
               <w:right w:val="single" w:sz="4" w:space="0" w:color="auto"/>
             </w:tcBorders>
           </w:tcPr>
-          <w:p>
-            <w:r/>
-            <w:r/>
-          </w:p>
+          <w:p/>
         </w:tc>
       </w:tr>
       <w:tr>
@@ -8589,7 +6854,6 @@
             <w:vAlign w:val="center"/>
           </w:tcPr>
           <w:p>
-            <w:r/>
             <w:r>
               <w:t>{{ item.posto_grad_quadro }}</w:t>
             </w:r>
@@ -8607,7 +6871,6 @@
             <w:vAlign w:val="center"/>
           </w:tcPr>
           <w:p>
-            <w:r/>
             <w:r>
               <w:t>{{ item.nome_completo }}</w:t>
             </w:r>
@@ -8624,7 +6887,6 @@
             </w:tcBorders>
           </w:tcPr>
           <w:p>
-            <w:r/>
             <w:r>
               <w:t>{{ item.rg }}</w:t>
             </w:r>
@@ -8648,7 +6910,6 @@
             <w:vAlign w:val="center"/>
           </w:tcPr>
           <w:p>
-            <w:r/>
             <w:r>
               <w:t>{%tr endfor %}</w:t>
             </w:r>
@@ -8665,10 +6926,7 @@
             </w:tcBorders>
             <w:vAlign w:val="center"/>
           </w:tcPr>
-          <w:p>
-            <w:r/>
-            <w:r/>
-          </w:p>
+          <w:p/>
         </w:tc>
         <w:tc>
           <w:tcPr>
@@ -8680,10 +6938,7 @@
               <w:right w:val="single" w:sz="4" w:space="0" w:color="auto"/>
             </w:tcBorders>
           </w:tcPr>
-          <w:p>
-            <w:r/>
-            <w:r/>
-          </w:p>
+          <w:p/>
         </w:tc>
       </w:tr>
     </w:tbl>
@@ -8698,6 +6953,17 @@
         </w:tabs>
         <w:ind w:right="-144"/>
       </w:pPr>
+      <w:r>
+        <w:t>{%</w:t>
+      </w:r>
+      <w:proofErr w:type="spellStart"/>
+      <w:r>
+        <w:t>endif</w:t>
+      </w:r>
+      <w:proofErr w:type="spellEnd"/>
+      <w:r>
+        <w:t>%}</w:t>
+      </w:r>
     </w:p>
     <w:p>
       <w:pPr>
@@ -8710,15 +6976,11 @@
         </w:tabs>
         <w:ind w:right="-144"/>
         <w:rPr>
-          <w:b/>
           <w:color w:val="000000" w:themeColor="text1"/>
           <w:sz w:val="22"/>
           <w:szCs w:val="22"/>
         </w:rPr>
       </w:pPr>
-      <w:r>
-        <w:t>APTO PARA O SERVIÇO DO CBMAM COM RESTRIÇÃO.</w:t>
-      </w:r>
     </w:p>
     <w:p>
       <w:pPr>
@@ -8726,29 +6988,19 @@
           <w:tab w:val="left" w:pos="3544"/>
           <w:tab w:val="left" w:pos="3828"/>
           <w:tab w:val="left" w:pos="3969"/>
+          <w:tab w:val="left" w:pos="9214"/>
+          <w:tab w:val="left" w:pos="9923"/>
         </w:tabs>
         <w:ind w:right="-144"/>
         <w:rPr>
-          <w:sz w:val="22"/>
-          <w:szCs w:val="22"/>
-        </w:rPr>
-      </w:pPr>
-    </w:p>
-    <w:p>
-      <w:pPr>
-        <w:tabs>
-          <w:tab w:val="left" w:pos="3544"/>
-          <w:tab w:val="left" w:pos="3828"/>
-          <w:tab w:val="left" w:pos="3969"/>
-        </w:tabs>
-        <w:ind w:left="142" w:right="-144" w:firstLine="142"/>
-        <w:rPr>
-          <w:sz w:val="22"/>
-          <w:szCs w:val="22"/>
-        </w:rPr>
-      </w:pPr>
-      <w:r>
-        <w:t>{%endif%}</w:t>
+          <w:b/>
+          <w:color w:val="000000" w:themeColor="text1"/>
+          <w:sz w:val="22"/>
+          <w:szCs w:val="22"/>
+        </w:rPr>
+      </w:pPr>
+      <w:r>
+        <w:t>LICENÇA PARA TRATAMENTO DE SAÚDE DE PESSOA DA FAMÍLIA (L.T.S.P.F).</w:t>
       </w:r>
     </w:p>
     <w:tbl>
@@ -8919,7 +7171,6 @@
             <w:vAlign w:val="center"/>
           </w:tcPr>
           <w:p>
-            <w:r/>
             <w:r>
               <w:t>{%tr for item in ltspf %}</w:t>
             </w:r>
@@ -8930,29 +7181,20 @@
             <w:tcW w:w="2464" w:type="pct"/>
             <w:vAlign w:val="center"/>
           </w:tcPr>
-          <w:p>
-            <w:r/>
-            <w:r/>
-          </w:p>
+          <w:p/>
         </w:tc>
         <w:tc>
           <w:tcPr>
             <w:tcW w:w="1159" w:type="pct"/>
           </w:tcPr>
-          <w:p>
-            <w:r/>
-            <w:r/>
-          </w:p>
+          <w:p/>
         </w:tc>
         <w:tc>
           <w:tcPr>
             <w:tcW w:w="435" w:type="pct"/>
             <w:vAlign w:val="center"/>
           </w:tcPr>
-          <w:p>
-            <w:r/>
-            <w:r/>
-          </w:p>
+          <w:p/>
         </w:tc>
       </w:tr>
       <w:tr>
@@ -8965,7 +7207,6 @@
             <w:vAlign w:val="center"/>
           </w:tcPr>
           <w:p>
-            <w:r/>
             <w:r>
               <w:t>{{ item.posto_grad_quadro }}</w:t>
             </w:r>
@@ -8977,7 +7218,6 @@
             <w:vAlign w:val="center"/>
           </w:tcPr>
           <w:p>
-            <w:r/>
             <w:r>
               <w:t>{{ item.nome_completo }}</w:t>
             </w:r>
@@ -8998,7 +7238,6 @@
             <w:tcW w:w="1159" w:type="pct"/>
           </w:tcPr>
           <w:p>
-            <w:r/>
             <w:r>
               <w:t xml:space="preserve">PRONTO PARA SV: </w:t>
             </w:r>
@@ -9015,7 +7254,6 @@
             <w:vAlign w:val="center"/>
           </w:tcPr>
           <w:p>
-            <w:r/>
             <w:r>
               <w:t>{{item.rg}}</w:t>
             </w:r>
@@ -9032,7 +7270,6 @@
             <w:vAlign w:val="center"/>
           </w:tcPr>
           <w:p>
-            <w:r/>
             <w:r>
               <w:t>{%tr endfor %}</w:t>
             </w:r>
@@ -9043,33 +7280,23 @@
             <w:tcW w:w="2464" w:type="pct"/>
             <w:vAlign w:val="center"/>
           </w:tcPr>
-          <w:p>
-            <w:r/>
-            <w:r/>
-          </w:p>
+          <w:p/>
         </w:tc>
         <w:tc>
           <w:tcPr>
             <w:tcW w:w="1159" w:type="pct"/>
           </w:tcPr>
-          <w:p>
-            <w:r/>
-            <w:r/>
-          </w:p>
+          <w:p/>
         </w:tc>
         <w:tc>
           <w:tcPr>
             <w:tcW w:w="435" w:type="pct"/>
             <w:vAlign w:val="center"/>
           </w:tcPr>
-          <w:p>
-            <w:r/>
-            <w:r/>
-          </w:p>
+          <w:p/>
         </w:tc>
       </w:tr>
     </w:tbl>
-    <w:bookmarkEnd w:id="2"/>
     <w:p>
       <w:pPr>
         <w:tabs>
@@ -9081,6 +7308,7 @@
         </w:tabs>
         <w:ind w:right="-144"/>
         <w:rPr>
+          <w:b/>
           <w:color w:val="000000" w:themeColor="text1"/>
           <w:sz w:val="22"/>
           <w:szCs w:val="22"/>
@@ -9092,7 +7320,6 @@
           <w:sz w:val="22"/>
           <w:szCs w:val="22"/>
         </w:rPr>
-        <w:lastRenderedPageBreak/>
         <w:t>{%</w:t>
       </w:r>
       <w:proofErr w:type="spellStart"/>
@@ -9116,229 +7343,13 @@
     </w:p>
     <w:p>
       <w:pPr>
-        <w:tabs>
-          <w:tab w:val="left" w:pos="3544"/>
-          <w:tab w:val="left" w:pos="3828"/>
-          <w:tab w:val="left" w:pos="3969"/>
-          <w:tab w:val="left" w:pos="9214"/>
-          <w:tab w:val="left" w:pos="9923"/>
-        </w:tabs>
-        <w:ind w:right="-144"/>
-        <w:rPr>
-          <w:b/>
-          <w:color w:val="000000" w:themeColor="text1"/>
-          <w:sz w:val="22"/>
-          <w:szCs w:val="22"/>
-        </w:rPr>
-      </w:pPr>
-      <w:r>
-        <w:t>LICENÇA PARA TRATAMENTO DE SAÚDE DE PESSOA DA FAMÍLIA (L.T.S.P.F).</w:t>
-      </w:r>
+        <w:jc w:val="both"/>
+        <w:rPr>
+          <w:sz w:val="22"/>
+          <w:szCs w:val="22"/>
+        </w:rPr>
+      </w:pPr>
     </w:p>
-    <w:p>
-      <w:pPr>
-        <w:jc w:val="both"/>
-        <w:rPr>
-          <w:sz w:val="22"/>
-          <w:szCs w:val="22"/>
-        </w:rPr>
-      </w:pPr>
-    </w:p>
-    <w:tbl>
-      <w:tblPr>
-        <w:tblW w:w="9781" w:type="dxa"/>
-        <w:tblInd w:w="-5" w:type="dxa"/>
-        <w:tblBorders>
-          <w:top w:val="single" w:sz="4" w:space="0" w:color="auto"/>
-          <w:left w:val="single" w:sz="4" w:space="0" w:color="auto"/>
-          <w:bottom w:val="single" w:sz="4" w:space="0" w:color="auto"/>
-          <w:right w:val="single" w:sz="4" w:space="0" w:color="auto"/>
-          <w:insideH w:val="single" w:sz="4" w:space="0" w:color="auto"/>
-          <w:insideV w:val="single" w:sz="4" w:space="0" w:color="auto"/>
-        </w:tblBorders>
-        <w:tblLayout w:type="fixed"/>
-        <w:tblLook w:val="01E0" w:firstRow="1" w:lastRow="1" w:firstColumn="1" w:lastColumn="1" w:noHBand="0" w:noVBand="0"/>
-      </w:tblPr>
-      <w:tblGrid>
-        <w:gridCol w:w="1702"/>
-        <w:gridCol w:w="8079"/>
-      </w:tblGrid>
-      <w:tr>
-        <w:trPr>
-          <w:trHeight w:val="187"/>
-        </w:trPr>
-        <w:tc>
-          <w:tcPr>
-            <w:tcW w:w="870" w:type="pct"/>
-            <w:tcBorders>
-              <w:top w:val="single" w:sz="4" w:space="0" w:color="auto"/>
-              <w:left w:val="single" w:sz="4" w:space="0" w:color="auto"/>
-              <w:bottom w:val="single" w:sz="4" w:space="0" w:color="auto"/>
-              <w:right w:val="single" w:sz="4" w:space="0" w:color="auto"/>
-            </w:tcBorders>
-            <w:vAlign w:val="center"/>
-            <w:hideMark/>
-          </w:tcPr>
-          <w:p>
-            <w:pPr>
-              <w:spacing w:line="256" w:lineRule="auto"/>
-              <w:jc w:val="center"/>
-              <w:rPr>
-                <w:b/>
-                <w:bCs/>
-                <w:sz w:val="22"/>
-                <w:szCs w:val="22"/>
-                <w:lang w:eastAsia="en-US"/>
-              </w:rPr>
-            </w:pPr>
-            <w:r>
-              <w:rPr>
-                <w:b/>
-                <w:bCs/>
-                <w:sz w:val="22"/>
-                <w:szCs w:val="22"/>
-                <w:lang w:eastAsia="en-US"/>
-              </w:rPr>
-              <w:t>POSTO/GRAD</w:t>
-            </w:r>
-          </w:p>
-        </w:tc>
-        <w:tc>
-          <w:tcPr>
-            <w:tcW w:w="4130" w:type="pct"/>
-            <w:tcBorders>
-              <w:top w:val="single" w:sz="4" w:space="0" w:color="auto"/>
-              <w:left w:val="single" w:sz="4" w:space="0" w:color="auto"/>
-              <w:bottom w:val="single" w:sz="4" w:space="0" w:color="auto"/>
-              <w:right w:val="single" w:sz="4" w:space="0" w:color="auto"/>
-            </w:tcBorders>
-            <w:vAlign w:val="center"/>
-            <w:hideMark/>
-          </w:tcPr>
-          <w:p>
-            <w:pPr>
-              <w:pStyle w:val="Rodap"/>
-              <w:tabs>
-                <w:tab w:val="left" w:pos="708"/>
-              </w:tabs>
-              <w:spacing w:line="256" w:lineRule="auto"/>
-              <w:jc w:val="center"/>
-              <w:rPr>
-                <w:b/>
-                <w:bCs/>
-              </w:rPr>
-            </w:pPr>
-            <w:r>
-              <w:rPr>
-                <w:b/>
-                <w:bCs/>
-              </w:rPr>
-              <w:t>NOME</w:t>
-            </w:r>
-          </w:p>
-        </w:tc>
-      </w:tr>
-      <w:tr>
-        <w:trPr>
-          <w:trHeight w:val="187"/>
-        </w:trPr>
-        <w:tc>
-          <w:tcPr>
-            <w:tcW w:w="870" w:type="pct"/>
-            <w:tcBorders>
-              <w:top w:val="single" w:sz="4" w:space="0" w:color="auto"/>
-              <w:left w:val="single" w:sz="4" w:space="0" w:color="auto"/>
-              <w:bottom w:val="single" w:sz="4" w:space="0" w:color="auto"/>
-              <w:right w:val="single" w:sz="4" w:space="0" w:color="auto"/>
-            </w:tcBorders>
-            <w:vAlign w:val="center"/>
-          </w:tcPr>
-          <w:p>
-            <w:pPr>
-              <w:spacing w:line="256" w:lineRule="auto"/>
-              <w:jc w:val="center"/>
-              <w:rPr>
-                <w:sz w:val="22"/>
-                <w:szCs w:val="22"/>
-                <w:lang w:eastAsia="en-US"/>
-              </w:rPr>
-            </w:pPr>
-            <w:r>
-              <w:rPr>
-                <w:sz w:val="22"/>
-                <w:szCs w:val="22"/>
-                <w:lang w:eastAsia="en-US"/>
-              </w:rPr>
-              <w:t>CEL</w:t>
-            </w:r>
-            <w:r>
-              <w:rPr>
-                <w:sz w:val="22"/>
-                <w:szCs w:val="22"/>
-                <w:lang w:eastAsia="en-US"/>
-              </w:rPr>
-              <w:t xml:space="preserve"> BM</w:t>
-            </w:r>
-            <w:r>
-              <w:rPr>
-                <w:sz w:val="22"/>
-                <w:szCs w:val="22"/>
-                <w:lang w:eastAsia="en-US"/>
-              </w:rPr>
-              <w:t xml:space="preserve"> R/R</w:t>
-            </w:r>
-          </w:p>
-        </w:tc>
-        <w:tc>
-          <w:tcPr>
-            <w:tcW w:w="4130" w:type="pct"/>
-            <w:tcBorders>
-              <w:top w:val="single" w:sz="4" w:space="0" w:color="auto"/>
-              <w:left w:val="single" w:sz="4" w:space="0" w:color="auto"/>
-              <w:bottom w:val="single" w:sz="4" w:space="0" w:color="auto"/>
-              <w:right w:val="single" w:sz="4" w:space="0" w:color="auto"/>
-            </w:tcBorders>
-            <w:vAlign w:val="center"/>
-            <w:hideMark/>
-          </w:tcPr>
-          <w:p>
-            <w:pPr>
-              <w:tabs>
-                <w:tab w:val="left" w:pos="7560"/>
-              </w:tabs>
-              <w:spacing w:line="256" w:lineRule="auto"/>
-              <w:jc w:val="center"/>
-              <w:rPr>
-                <w:sz w:val="22"/>
-                <w:szCs w:val="22"/>
-                <w:lang w:eastAsia="en-US"/>
-              </w:rPr>
-            </w:pPr>
-            <w:r>
-              <w:rPr>
-                <w:sz w:val="22"/>
-                <w:szCs w:val="22"/>
-                <w:lang w:eastAsia="en-US"/>
-              </w:rPr>
-              <w:t>ANTONIO DIAS DOS SANTOS</w:t>
-            </w:r>
-          </w:p>
-          <w:p>
-            <w:pPr>
-              <w:tabs>
-                <w:tab w:val="left" w:pos="7560"/>
-              </w:tabs>
-              <w:spacing w:line="256" w:lineRule="auto"/>
-              <w:rPr>
-                <w:sz w:val="22"/>
-                <w:szCs w:val="22"/>
-                <w:lang w:eastAsia="en-US"/>
-              </w:rPr>
-            </w:pPr>
-          </w:p>
-        </w:tc>
-      </w:tr>
-    </w:tbl>
     <w:p>
       <w:pPr>
         <w:tabs>
@@ -14578,7 +12589,7 @@
   <w:style w:type="paragraph" w:default="1" w:styleId="Normal">
     <w:name w:val="Normal"/>
     <w:qFormat/>
-    <w:rsid w:val="000821CD"/>
+    <w:rsid w:val="00B27ED0"/>
     <w:pPr>
       <w:suppressAutoHyphens/>
       <w:spacing w:after="0" w:line="240" w:lineRule="auto"/>
@@ -15362,7 +13373,7 @@
 </file>
 
 <file path=customXml/itemProps1.xml><?xml version="1.0" encoding="utf-8"?>
-<ds:datastoreItem xmlns:ds="http://schemas.openxmlformats.org/officeDocument/2006/customXml" ds:itemID="{182D1327-DCF0-470F-92F9-D930DF8328E1}">
+<ds:datastoreItem xmlns:ds="http://schemas.openxmlformats.org/officeDocument/2006/customXml" ds:itemID="{D448EC51-AF8E-4A04-948F-D4FD736D6B9F}">
   <ds:schemaRefs>
     <ds:schemaRef ds:uri="http://schemas.openxmlformats.org/officeDocument/2006/bibliography"/>
   </ds:schemaRefs>

</xml_diff>